<commit_message>
added more to the main doc
</commit_message>
<xml_diff>
--- a/Material_Estudio/resumen_legislacion.docx
+++ b/Material_Estudio/resumen_legislacion.docx
@@ -23,7 +23,17 @@
           <w:sz w:val="48"/>
           <w:szCs w:val="48"/>
         </w:rPr>
-        <w:t>RESUMEN DE LEGISLACIÓN</w:t>
+        <w:t xml:space="preserve">RESUMEN DE </w:t>
+      </w:r>
+      <w:r>
+        <w:rPr>
+          <w:b/>
+          <w:bCs/>
+          <w:color w:val="FFFFFF"/>
+          <w:sz w:val="48"/>
+          <w:szCs w:val="48"/>
+        </w:rPr>
+        <w:t>TEMARIO</w:t>
       </w:r>
     </w:p>
     <w:p>
@@ -66,40 +76,36 @@
         <w:spacing w:before="200" w:after="600"/>
         <w:jc w:val="center"/>
         <w:rPr>
-          <w:i/>
-          <w:iCs/>
-          <w:color w:val="666666"/>
-        </w:rPr>
-      </w:pPr>
-    </w:p>
-    <w:p>
-      <w:pPr>
-        <w:spacing w:before="200" w:after="600"/>
-        <w:jc w:val="center"/>
-        <w:rPr>
-          <w:color w:val="666666"/>
           <w:sz w:val="32"/>
           <w:szCs w:val="32"/>
         </w:rPr>
       </w:pPr>
-      <w:r>
-        <w:rPr>
-          <w:color w:val="666666"/>
-          <w:sz w:val="32"/>
-          <w:szCs w:val="32"/>
-        </w:rPr>
-        <w:t>Acceso a los exámenes de prueba</w:t>
-      </w:r>
-    </w:p>
-    <w:p>
-      <w:pPr>
-        <w:spacing w:before="200" w:after="600"/>
-        <w:jc w:val="center"/>
-        <w:rPr>
-          <w:sz w:val="32"/>
-          <w:szCs w:val="32"/>
-        </w:rPr>
-      </w:pPr>
+      <w:hyperlink r:id="rId8" w:history="1">
+        <w:r>
+          <w:rPr>
+            <w:rStyle w:val="Hipervnculo"/>
+            <w:sz w:val="32"/>
+            <w:szCs w:val="32"/>
+          </w:rPr>
+          <w:t>ACCESO A EXAM</w:t>
+        </w:r>
+        <w:r>
+          <w:rPr>
+            <w:rStyle w:val="Hipervnculo"/>
+            <w:sz w:val="32"/>
+            <w:szCs w:val="32"/>
+          </w:rPr>
+          <w:t>E</w:t>
+        </w:r>
+        <w:r>
+          <w:rPr>
+            <w:rStyle w:val="Hipervnculo"/>
+            <w:sz w:val="32"/>
+            <w:szCs w:val="32"/>
+          </w:rPr>
+          <w:t>NES DE PRUEBA</w:t>
+        </w:r>
+      </w:hyperlink>
     </w:p>
     <w:p>
       <w:r>
@@ -108,6 +114,14 @@
     </w:p>
     <w:sdt>
       <w:sdtPr>
+        <w:rPr>
+          <w:rFonts w:ascii="Arial" w:eastAsia="Arial" w:hAnsi="Arial" w:cs="Arial"/>
+          <w:b w:val="0"/>
+          <w:bCs w:val="0"/>
+          <w:color w:val="auto"/>
+          <w:sz w:val="20"/>
+          <w:szCs w:val="20"/>
+        </w:rPr>
         <w:id w:val="-2018454433"/>
         <w:docPartObj>
           <w:docPartGallery w:val="Table of Contents"/>
@@ -116,11 +130,7 @@
       </w:sdtPr>
       <w:sdtEndPr>
         <w:rPr>
-          <w:rFonts w:ascii="Arial" w:eastAsia="Arial" w:hAnsi="Arial" w:cs="Arial"/>
           <w:noProof/>
-          <w:color w:val="auto"/>
-          <w:sz w:val="20"/>
-          <w:szCs w:val="20"/>
         </w:rPr>
       </w:sdtEndPr>
       <w:sdtContent>
@@ -166,7 +176,7 @@
             </w:rPr>
             <w:fldChar w:fldCharType="separate"/>
           </w:r>
-          <w:hyperlink w:anchor="_Toc229053015" w:history="1">
+          <w:hyperlink w:anchor="_Toc229054351" w:history="1">
             <w:r>
               <w:rPr>
                 <w:rStyle w:val="Hipervnculo"/>
@@ -193,7 +203,7 @@
                 <w:noProof/>
                 <w:webHidden/>
               </w:rPr>
-              <w:instrText xml:space="preserve"> PAGEREF _Toc229053015 \h </w:instrText>
+              <w:instrText xml:space="preserve"> PAGEREF _Toc229054351 \h </w:instrText>
             </w:r>
             <w:r>
               <w:rPr>
@@ -241,7 +251,7 @@
               <w14:ligatures w14:val="standardContextual"/>
             </w:rPr>
           </w:pPr>
-          <w:hyperlink w:anchor="_Toc229053016" w:history="1">
+          <w:hyperlink w:anchor="_Toc229054352" w:history="1">
             <w:r>
               <w:rPr>
                 <w:rStyle w:val="Hipervnculo"/>
@@ -268,7 +278,7 @@
                 <w:noProof/>
                 <w:webHidden/>
               </w:rPr>
-              <w:instrText xml:space="preserve"> PAGEREF _Toc229053016 \h </w:instrText>
+              <w:instrText xml:space="preserve"> PAGEREF _Toc229054352 \h </w:instrText>
             </w:r>
             <w:r>
               <w:rPr>
@@ -316,7 +326,7 @@
               <w14:ligatures w14:val="standardContextual"/>
             </w:rPr>
           </w:pPr>
-          <w:hyperlink w:anchor="_Toc229053017" w:history="1">
+          <w:hyperlink w:anchor="_Toc229054353" w:history="1">
             <w:r>
               <w:rPr>
                 <w:rStyle w:val="Hipervnculo"/>
@@ -343,7 +353,7 @@
                 <w:noProof/>
                 <w:webHidden/>
               </w:rPr>
-              <w:instrText xml:space="preserve"> PAGEREF _Toc229053017 \h </w:instrText>
+              <w:instrText xml:space="preserve"> PAGEREF _Toc229054353 \h </w:instrText>
             </w:r>
             <w:r>
               <w:rPr>
@@ -391,7 +401,7 @@
               <w14:ligatures w14:val="standardContextual"/>
             </w:rPr>
           </w:pPr>
-          <w:hyperlink w:anchor="_Toc229053018" w:history="1">
+          <w:hyperlink w:anchor="_Toc229054354" w:history="1">
             <w:r>
               <w:rPr>
                 <w:rStyle w:val="Hipervnculo"/>
@@ -418,7 +428,7 @@
                 <w:noProof/>
                 <w:webHidden/>
               </w:rPr>
-              <w:instrText xml:space="preserve"> PAGEREF _Toc229053018 \h </w:instrText>
+              <w:instrText xml:space="preserve"> PAGEREF _Toc229054354 \h </w:instrText>
             </w:r>
             <w:r>
               <w:rPr>
@@ -466,7 +476,7 @@
               <w14:ligatures w14:val="standardContextual"/>
             </w:rPr>
           </w:pPr>
-          <w:hyperlink w:anchor="_Toc229053019" w:history="1">
+          <w:hyperlink w:anchor="_Toc229054355" w:history="1">
             <w:r>
               <w:rPr>
                 <w:rStyle w:val="Hipervnculo"/>
@@ -493,7 +503,7 @@
                 <w:noProof/>
                 <w:webHidden/>
               </w:rPr>
-              <w:instrText xml:space="preserve"> PAGEREF _Toc229053019 \h </w:instrText>
+              <w:instrText xml:space="preserve"> PAGEREF _Toc229054355 \h </w:instrText>
             </w:r>
             <w:r>
               <w:rPr>
@@ -541,7 +551,7 @@
               <w14:ligatures w14:val="standardContextual"/>
             </w:rPr>
           </w:pPr>
-          <w:hyperlink w:anchor="_Toc229053020" w:history="1">
+          <w:hyperlink w:anchor="_Toc229054356" w:history="1">
             <w:r>
               <w:rPr>
                 <w:rStyle w:val="Hipervnculo"/>
@@ -568,7 +578,7 @@
                 <w:noProof/>
                 <w:webHidden/>
               </w:rPr>
-              <w:instrText xml:space="preserve"> PAGEREF _Toc229053020 \h </w:instrText>
+              <w:instrText xml:space="preserve"> PAGEREF _Toc229054356 \h </w:instrText>
             </w:r>
             <w:r>
               <w:rPr>
@@ -616,7 +626,7 @@
               <w14:ligatures w14:val="standardContextual"/>
             </w:rPr>
           </w:pPr>
-          <w:hyperlink w:anchor="_Toc229053021" w:history="1">
+          <w:hyperlink w:anchor="_Toc229054357" w:history="1">
             <w:r>
               <w:rPr>
                 <w:rStyle w:val="Hipervnculo"/>
@@ -643,7 +653,7 @@
                 <w:noProof/>
                 <w:webHidden/>
               </w:rPr>
-              <w:instrText xml:space="preserve"> PAGEREF _Toc229053021 \h </w:instrText>
+              <w:instrText xml:space="preserve"> PAGEREF _Toc229054357 \h </w:instrText>
             </w:r>
             <w:r>
               <w:rPr>
@@ -691,7 +701,7 @@
               <w14:ligatures w14:val="standardContextual"/>
             </w:rPr>
           </w:pPr>
-          <w:hyperlink w:anchor="_Toc229053022" w:history="1">
+          <w:hyperlink w:anchor="_Toc229054358" w:history="1">
             <w:r>
               <w:rPr>
                 <w:rStyle w:val="Hipervnculo"/>
@@ -718,7 +728,7 @@
                 <w:noProof/>
                 <w:webHidden/>
               </w:rPr>
-              <w:instrText xml:space="preserve"> PAGEREF _Toc229053022 \h </w:instrText>
+              <w:instrText xml:space="preserve"> PAGEREF _Toc229054358 \h </w:instrText>
             </w:r>
             <w:r>
               <w:rPr>
@@ -766,7 +776,7 @@
               <w14:ligatures w14:val="standardContextual"/>
             </w:rPr>
           </w:pPr>
-          <w:hyperlink w:anchor="_Toc229053023" w:history="1">
+          <w:hyperlink w:anchor="_Toc229054359" w:history="1">
             <w:r>
               <w:rPr>
                 <w:rStyle w:val="Hipervnculo"/>
@@ -793,7 +803,7 @@
                 <w:noProof/>
                 <w:webHidden/>
               </w:rPr>
-              <w:instrText xml:space="preserve"> PAGEREF _Toc229053023 \h </w:instrText>
+              <w:instrText xml:space="preserve"> PAGEREF _Toc229054359 \h </w:instrText>
             </w:r>
             <w:r>
               <w:rPr>
@@ -841,7 +851,7 @@
               <w14:ligatures w14:val="standardContextual"/>
             </w:rPr>
           </w:pPr>
-          <w:hyperlink w:anchor="_Toc229053024" w:history="1">
+          <w:hyperlink w:anchor="_Toc229054360" w:history="1">
             <w:r>
               <w:rPr>
                 <w:rStyle w:val="Hipervnculo"/>
@@ -868,7 +878,7 @@
                 <w:noProof/>
                 <w:webHidden/>
               </w:rPr>
-              <w:instrText xml:space="preserve"> PAGEREF _Toc229053024 \h </w:instrText>
+              <w:instrText xml:space="preserve"> PAGEREF _Toc229054360 \h </w:instrText>
             </w:r>
             <w:r>
               <w:rPr>
@@ -916,7 +926,7 @@
               <w14:ligatures w14:val="standardContextual"/>
             </w:rPr>
           </w:pPr>
-          <w:hyperlink w:anchor="_Toc229053025" w:history="1">
+          <w:hyperlink w:anchor="_Toc229054361" w:history="1">
             <w:r>
               <w:rPr>
                 <w:rStyle w:val="Hipervnculo"/>
@@ -943,7 +953,7 @@
                 <w:noProof/>
                 <w:webHidden/>
               </w:rPr>
-              <w:instrText xml:space="preserve"> PAGEREF _Toc229053025 \h </w:instrText>
+              <w:instrText xml:space="preserve"> PAGEREF _Toc229054361 \h </w:instrText>
             </w:r>
             <w:r>
               <w:rPr>
@@ -991,7 +1001,7 @@
               <w14:ligatures w14:val="standardContextual"/>
             </w:rPr>
           </w:pPr>
-          <w:hyperlink w:anchor="_Toc229053026" w:history="1">
+          <w:hyperlink w:anchor="_Toc229054362" w:history="1">
             <w:r>
               <w:rPr>
                 <w:rStyle w:val="Hipervnculo"/>
@@ -1018,7 +1028,7 @@
                 <w:noProof/>
                 <w:webHidden/>
               </w:rPr>
-              <w:instrText xml:space="preserve"> PAGEREF _Toc229053026 \h </w:instrText>
+              <w:instrText xml:space="preserve"> PAGEREF _Toc229054362 \h </w:instrText>
             </w:r>
             <w:r>
               <w:rPr>
@@ -1066,7 +1076,7 @@
               <w14:ligatures w14:val="standardContextual"/>
             </w:rPr>
           </w:pPr>
-          <w:hyperlink w:anchor="_Toc229053027" w:history="1">
+          <w:hyperlink w:anchor="_Toc229054363" w:history="1">
             <w:r>
               <w:rPr>
                 <w:rStyle w:val="Hipervnculo"/>
@@ -1093,7 +1103,7 @@
                 <w:noProof/>
                 <w:webHidden/>
               </w:rPr>
-              <w:instrText xml:space="preserve"> PAGEREF _Toc229053027 \h </w:instrText>
+              <w:instrText xml:space="preserve"> PAGEREF _Toc229054363 \h </w:instrText>
             </w:r>
             <w:r>
               <w:rPr>
@@ -1139,7 +1149,7 @@
               <w14:ligatures w14:val="standardContextual"/>
             </w:rPr>
           </w:pPr>
-          <w:hyperlink w:anchor="_Toc229053028" w:history="1">
+          <w:hyperlink w:anchor="_Toc229054364" w:history="1">
             <w:r>
               <w:rPr>
                 <w:rStyle w:val="Hipervnculo"/>
@@ -1166,7 +1176,7 @@
                 <w:noProof/>
                 <w:webHidden/>
               </w:rPr>
-              <w:instrText xml:space="preserve"> PAGEREF _Toc229053028 \h </w:instrText>
+              <w:instrText xml:space="preserve"> PAGEREF _Toc229054364 \h </w:instrText>
             </w:r>
             <w:r>
               <w:rPr>
@@ -1212,7 +1222,7 @@
               <w14:ligatures w14:val="standardContextual"/>
             </w:rPr>
           </w:pPr>
-          <w:hyperlink w:anchor="_Toc229053029" w:history="1">
+          <w:hyperlink w:anchor="_Toc229054365" w:history="1">
             <w:r>
               <w:rPr>
                 <w:rStyle w:val="Hipervnculo"/>
@@ -1239,7 +1249,7 @@
                 <w:noProof/>
                 <w:webHidden/>
               </w:rPr>
-              <w:instrText xml:space="preserve"> PAGEREF _Toc229053029 \h </w:instrText>
+              <w:instrText xml:space="preserve"> PAGEREF _Toc229054365 \h </w:instrText>
             </w:r>
             <w:r>
               <w:rPr>
@@ -1287,7 +1297,7 @@
               <w14:ligatures w14:val="standardContextual"/>
             </w:rPr>
           </w:pPr>
-          <w:hyperlink w:anchor="_Toc229053030" w:history="1">
+          <w:hyperlink w:anchor="_Toc229054366" w:history="1">
             <w:r>
               <w:rPr>
                 <w:rStyle w:val="Hipervnculo"/>
@@ -1314,7 +1324,7 @@
                 <w:noProof/>
                 <w:webHidden/>
               </w:rPr>
-              <w:instrText xml:space="preserve"> PAGEREF _Toc229053030 \h </w:instrText>
+              <w:instrText xml:space="preserve"> PAGEREF _Toc229054366 \h </w:instrText>
             </w:r>
             <w:r>
               <w:rPr>
@@ -1360,7 +1370,7 @@
               <w14:ligatures w14:val="standardContextual"/>
             </w:rPr>
           </w:pPr>
-          <w:hyperlink w:anchor="_Toc229053031" w:history="1">
+          <w:hyperlink w:anchor="_Toc229054367" w:history="1">
             <w:r>
               <w:rPr>
                 <w:rStyle w:val="Hipervnculo"/>
@@ -1387,7 +1397,7 @@
                 <w:noProof/>
                 <w:webHidden/>
               </w:rPr>
-              <w:instrText xml:space="preserve"> PAGEREF _Toc229053031 \h </w:instrText>
+              <w:instrText xml:space="preserve"> PAGEREF _Toc229054367 \h </w:instrText>
             </w:r>
             <w:r>
               <w:rPr>
@@ -1433,7 +1443,7 @@
               <w14:ligatures w14:val="standardContextual"/>
             </w:rPr>
           </w:pPr>
-          <w:hyperlink w:anchor="_Toc229053032" w:history="1">
+          <w:hyperlink w:anchor="_Toc229054368" w:history="1">
             <w:r>
               <w:rPr>
                 <w:rStyle w:val="Hipervnculo"/>
@@ -1460,7 +1470,7 @@
                 <w:noProof/>
                 <w:webHidden/>
               </w:rPr>
-              <w:instrText xml:space="preserve"> PAGEREF _Toc229053032 \h </w:instrText>
+              <w:instrText xml:space="preserve"> PAGEREF _Toc229054368 \h </w:instrText>
             </w:r>
             <w:r>
               <w:rPr>
@@ -1508,7 +1518,7 @@
               <w14:ligatures w14:val="standardContextual"/>
             </w:rPr>
           </w:pPr>
-          <w:hyperlink w:anchor="_Toc229053033" w:history="1">
+          <w:hyperlink w:anchor="_Toc229054369" w:history="1">
             <w:r>
               <w:rPr>
                 <w:rStyle w:val="Hipervnculo"/>
@@ -1535,7 +1545,7 @@
                 <w:noProof/>
                 <w:webHidden/>
               </w:rPr>
-              <w:instrText xml:space="preserve"> PAGEREF _Toc229053033 \h </w:instrText>
+              <w:instrText xml:space="preserve"> PAGEREF _Toc229054369 \h </w:instrText>
             </w:r>
             <w:r>
               <w:rPr>
@@ -1583,7 +1593,7 @@
               <w14:ligatures w14:val="standardContextual"/>
             </w:rPr>
           </w:pPr>
-          <w:hyperlink w:anchor="_Toc229053034" w:history="1">
+          <w:hyperlink w:anchor="_Toc229054370" w:history="1">
             <w:r>
               <w:rPr>
                 <w:rStyle w:val="Hipervnculo"/>
@@ -1610,7 +1620,7 @@
                 <w:noProof/>
                 <w:webHidden/>
               </w:rPr>
-              <w:instrText xml:space="preserve"> PAGEREF _Toc229053034 \h </w:instrText>
+              <w:instrText xml:space="preserve"> PAGEREF _Toc229054370 \h </w:instrText>
             </w:r>
             <w:r>
               <w:rPr>
@@ -1658,7 +1668,7 @@
               <w14:ligatures w14:val="standardContextual"/>
             </w:rPr>
           </w:pPr>
-          <w:hyperlink w:anchor="_Toc229053035" w:history="1">
+          <w:hyperlink w:anchor="_Toc229054371" w:history="1">
             <w:r>
               <w:rPr>
                 <w:rStyle w:val="Hipervnculo"/>
@@ -1685,7 +1695,7 @@
                 <w:noProof/>
                 <w:webHidden/>
               </w:rPr>
-              <w:instrText xml:space="preserve"> PAGEREF _Toc229053035 \h </w:instrText>
+              <w:instrText xml:space="preserve"> PAGEREF _Toc229054371 \h </w:instrText>
             </w:r>
             <w:r>
               <w:rPr>
@@ -1733,7 +1743,7 @@
               <w14:ligatures w14:val="standardContextual"/>
             </w:rPr>
           </w:pPr>
-          <w:hyperlink w:anchor="_Toc229053036" w:history="1">
+          <w:hyperlink w:anchor="_Toc229054372" w:history="1">
             <w:r>
               <w:rPr>
                 <w:rStyle w:val="Hipervnculo"/>
@@ -1760,7 +1770,7 @@
                 <w:noProof/>
                 <w:webHidden/>
               </w:rPr>
-              <w:instrText xml:space="preserve"> PAGEREF _Toc229053036 \h </w:instrText>
+              <w:instrText xml:space="preserve"> PAGEREF _Toc229054372 \h </w:instrText>
             </w:r>
             <w:r>
               <w:rPr>
@@ -1808,27 +1818,13 @@
               <w14:ligatures w14:val="standardContextual"/>
             </w:rPr>
           </w:pPr>
-          <w:hyperlink w:anchor="_Toc229053037" w:history="1">
+          <w:hyperlink w:anchor="_Toc229054373" w:history="1">
             <w:r>
               <w:rPr>
                 <w:rStyle w:val="Hipervnculo"/>
                 <w:noProof/>
               </w:rPr>
-              <w:t>5. DECRETO 29/2018, d</w:t>
-            </w:r>
-            <w:r>
-              <w:rPr>
-                <w:rStyle w:val="Hipervnculo"/>
-                <w:noProof/>
-              </w:rPr>
-              <w:t>e</w:t>
-            </w:r>
-            <w:r>
-              <w:rPr>
-                <w:rStyle w:val="Hipervnculo"/>
-                <w:noProof/>
-              </w:rPr>
-              <w:t xml:space="preserve"> 17 de abril</w:t>
+              <w:t>5. DECRETO 29/2018, de 17 de abril</w:t>
             </w:r>
             <w:r>
               <w:rPr>
@@ -1849,7 +1845,7 @@
                 <w:noProof/>
                 <w:webHidden/>
               </w:rPr>
-              <w:instrText xml:space="preserve"> PAGEREF _Toc229053037 \h </w:instrText>
+              <w:instrText xml:space="preserve"> PAGEREF _Toc229054373 \h </w:instrText>
             </w:r>
             <w:r>
               <w:rPr>
@@ -1897,7 +1893,7 @@
               <w14:ligatures w14:val="standardContextual"/>
             </w:rPr>
           </w:pPr>
-          <w:hyperlink w:anchor="_Toc229053038" w:history="1">
+          <w:hyperlink w:anchor="_Toc229054374" w:history="1">
             <w:r>
               <w:rPr>
                 <w:rStyle w:val="Hipervnculo"/>
@@ -1924,7 +1920,7 @@
                 <w:noProof/>
                 <w:webHidden/>
               </w:rPr>
-              <w:instrText xml:space="preserve"> PAGEREF _Toc229053038 \h </w:instrText>
+              <w:instrText xml:space="preserve"> PAGEREF _Toc229054374 \h </w:instrText>
             </w:r>
             <w:r>
               <w:rPr>
@@ -1972,7 +1968,7 @@
               <w14:ligatures w14:val="standardContextual"/>
             </w:rPr>
           </w:pPr>
-          <w:hyperlink w:anchor="_Toc229053039" w:history="1">
+          <w:hyperlink w:anchor="_Toc229054375" w:history="1">
             <w:r>
               <w:rPr>
                 <w:rStyle w:val="Hipervnculo"/>
@@ -1999,7 +1995,7 @@
                 <w:noProof/>
                 <w:webHidden/>
               </w:rPr>
-              <w:instrText xml:space="preserve"> PAGEREF _Toc229053039 \h </w:instrText>
+              <w:instrText xml:space="preserve"> PAGEREF _Toc229054375 \h </w:instrText>
             </w:r>
             <w:r>
               <w:rPr>
@@ -2047,7 +2043,7 @@
               <w14:ligatures w14:val="standardContextual"/>
             </w:rPr>
           </w:pPr>
-          <w:hyperlink w:anchor="_Toc229053040" w:history="1">
+          <w:hyperlink w:anchor="_Toc229054376" w:history="1">
             <w:r>
               <w:rPr>
                 <w:rStyle w:val="Hipervnculo"/>
@@ -2074,7 +2070,7 @@
                 <w:noProof/>
                 <w:webHidden/>
               </w:rPr>
-              <w:instrText xml:space="preserve"> PAGEREF _Toc229053040 \h </w:instrText>
+              <w:instrText xml:space="preserve"> PAGEREF _Toc229054376 \h </w:instrText>
             </w:r>
             <w:r>
               <w:rPr>
@@ -2122,7 +2118,7 @@
               <w14:ligatures w14:val="standardContextual"/>
             </w:rPr>
           </w:pPr>
-          <w:hyperlink w:anchor="_Toc229053041" w:history="1">
+          <w:hyperlink w:anchor="_Toc229054377" w:history="1">
             <w:r>
               <w:rPr>
                 <w:rStyle w:val="Hipervnculo"/>
@@ -2149,7 +2145,7 @@
                 <w:noProof/>
                 <w:webHidden/>
               </w:rPr>
-              <w:instrText xml:space="preserve"> PAGEREF _Toc229053041 \h </w:instrText>
+              <w:instrText xml:space="preserve"> PAGEREF _Toc229054377 \h </w:instrText>
             </w:r>
             <w:r>
               <w:rPr>
@@ -2197,7 +2193,7 @@
               <w14:ligatures w14:val="standardContextual"/>
             </w:rPr>
           </w:pPr>
-          <w:hyperlink w:anchor="_Toc229053042" w:history="1">
+          <w:hyperlink w:anchor="_Toc229054378" w:history="1">
             <w:r>
               <w:rPr>
                 <w:rStyle w:val="Hipervnculo"/>
@@ -2224,7 +2220,7 @@
                 <w:noProof/>
                 <w:webHidden/>
               </w:rPr>
-              <w:instrText xml:space="preserve"> PAGEREF _Toc229053042 \h </w:instrText>
+              <w:instrText xml:space="preserve"> PAGEREF _Toc229054378 \h </w:instrText>
             </w:r>
             <w:r>
               <w:rPr>
@@ -2272,7 +2268,7 @@
               <w14:ligatures w14:val="standardContextual"/>
             </w:rPr>
           </w:pPr>
-          <w:hyperlink w:anchor="_Toc229053043" w:history="1">
+          <w:hyperlink w:anchor="_Toc229054379" w:history="1">
             <w:r>
               <w:rPr>
                 <w:rStyle w:val="Hipervnculo"/>
@@ -2299,7 +2295,7 @@
                 <w:noProof/>
                 <w:webHidden/>
               </w:rPr>
-              <w:instrText xml:space="preserve"> PAGEREF _Toc229053043 \h </w:instrText>
+              <w:instrText xml:space="preserve"> PAGEREF _Toc229054379 \h </w:instrText>
             </w:r>
             <w:r>
               <w:rPr>
@@ -2347,7 +2343,7 @@
               <w14:ligatures w14:val="standardContextual"/>
             </w:rPr>
           </w:pPr>
-          <w:hyperlink w:anchor="_Toc229053044" w:history="1">
+          <w:hyperlink w:anchor="_Toc229054380" w:history="1">
             <w:r>
               <w:rPr>
                 <w:rStyle w:val="Hipervnculo"/>
@@ -2374,7 +2370,7 @@
                 <w:noProof/>
                 <w:webHidden/>
               </w:rPr>
-              <w:instrText xml:space="preserve"> PAGEREF _Toc229053044 \h </w:instrText>
+              <w:instrText xml:space="preserve"> PAGEREF _Toc229054380 \h </w:instrText>
             </w:r>
             <w:r>
               <w:rPr>
@@ -2422,7 +2418,7 @@
               <w14:ligatures w14:val="standardContextual"/>
             </w:rPr>
           </w:pPr>
-          <w:hyperlink w:anchor="_Toc229053045" w:history="1">
+          <w:hyperlink w:anchor="_Toc229054381" w:history="1">
             <w:r>
               <w:rPr>
                 <w:rStyle w:val="Hipervnculo"/>
@@ -2449,7 +2445,7 @@
                 <w:noProof/>
                 <w:webHidden/>
               </w:rPr>
-              <w:instrText xml:space="preserve"> PAGEREF _Toc229053045 \h </w:instrText>
+              <w:instrText xml:space="preserve"> PAGEREF _Toc229054381 \h </w:instrText>
             </w:r>
             <w:r>
               <w:rPr>
@@ -2497,7 +2493,7 @@
               <w14:ligatures w14:val="standardContextual"/>
             </w:rPr>
           </w:pPr>
-          <w:hyperlink w:anchor="_Toc229053046" w:history="1">
+          <w:hyperlink w:anchor="_Toc229054382" w:history="1">
             <w:r>
               <w:rPr>
                 <w:rStyle w:val="Hipervnculo"/>
@@ -2524,7 +2520,7 @@
                 <w:noProof/>
                 <w:webHidden/>
               </w:rPr>
-              <w:instrText xml:space="preserve"> PAGEREF _Toc229053046 \h </w:instrText>
+              <w:instrText xml:space="preserve"> PAGEREF _Toc229054382 \h </w:instrText>
             </w:r>
             <w:r>
               <w:rPr>
@@ -2570,7 +2566,7 @@
               <w14:ligatures w14:val="standardContextual"/>
             </w:rPr>
           </w:pPr>
-          <w:hyperlink w:anchor="_Toc229053047" w:history="1">
+          <w:hyperlink w:anchor="_Toc229054383" w:history="1">
             <w:r>
               <w:rPr>
                 <w:rStyle w:val="Hipervnculo"/>
@@ -2597,7 +2593,7 @@
                 <w:noProof/>
                 <w:webHidden/>
               </w:rPr>
-              <w:instrText xml:space="preserve"> PAGEREF _Toc229053047 \h </w:instrText>
+              <w:instrText xml:space="preserve"> PAGEREF _Toc229054383 \h </w:instrText>
             </w:r>
             <w:r>
               <w:rPr>
@@ -2643,7 +2639,7 @@
               <w14:ligatures w14:val="standardContextual"/>
             </w:rPr>
           </w:pPr>
-          <w:hyperlink w:anchor="_Toc229053048" w:history="1">
+          <w:hyperlink w:anchor="_Toc229054384" w:history="1">
             <w:r>
               <w:rPr>
                 <w:rStyle w:val="Hipervnculo"/>
@@ -2670,7 +2666,7 @@
                 <w:noProof/>
                 <w:webHidden/>
               </w:rPr>
-              <w:instrText xml:space="preserve"> PAGEREF _Toc229053048 \h </w:instrText>
+              <w:instrText xml:space="preserve"> PAGEREF _Toc229054384 \h </w:instrText>
             </w:r>
             <w:r>
               <w:rPr>
@@ -2716,7 +2712,7 @@
               <w14:ligatures w14:val="standardContextual"/>
             </w:rPr>
           </w:pPr>
-          <w:hyperlink w:anchor="_Toc229053049" w:history="1">
+          <w:hyperlink w:anchor="_Toc229054385" w:history="1">
             <w:r>
               <w:rPr>
                 <w:rStyle w:val="Hipervnculo"/>
@@ -2743,7 +2739,7 @@
                 <w:noProof/>
                 <w:webHidden/>
               </w:rPr>
-              <w:instrText xml:space="preserve"> PAGEREF _Toc229053049 \h </w:instrText>
+              <w:instrText xml:space="preserve"> PAGEREF _Toc229054385 \h </w:instrText>
             </w:r>
             <w:r>
               <w:rPr>
@@ -2791,7 +2787,7 @@
               <w14:ligatures w14:val="standardContextual"/>
             </w:rPr>
           </w:pPr>
-          <w:hyperlink w:anchor="_Toc229053050" w:history="1">
+          <w:hyperlink w:anchor="_Toc229054386" w:history="1">
             <w:r>
               <w:rPr>
                 <w:rStyle w:val="Hipervnculo"/>
@@ -2818,7 +2814,7 @@
                 <w:noProof/>
                 <w:webHidden/>
               </w:rPr>
-              <w:instrText xml:space="preserve"> PAGEREF _Toc229053050 \h </w:instrText>
+              <w:instrText xml:space="preserve"> PAGEREF _Toc229054386 \h </w:instrText>
             </w:r>
             <w:r>
               <w:rPr>
@@ -2866,7 +2862,7 @@
               <w14:ligatures w14:val="standardContextual"/>
             </w:rPr>
           </w:pPr>
-          <w:hyperlink w:anchor="_Toc229053051" w:history="1">
+          <w:hyperlink w:anchor="_Toc229054387" w:history="1">
             <w:r>
               <w:rPr>
                 <w:rStyle w:val="Hipervnculo"/>
@@ -2893,7 +2889,7 @@
                 <w:noProof/>
                 <w:webHidden/>
               </w:rPr>
-              <w:instrText xml:space="preserve"> PAGEREF _Toc229053051 \h </w:instrText>
+              <w:instrText xml:space="preserve"> PAGEREF _Toc229054387 \h </w:instrText>
             </w:r>
             <w:r>
               <w:rPr>
@@ -2941,7 +2937,7 @@
               <w14:ligatures w14:val="standardContextual"/>
             </w:rPr>
           </w:pPr>
-          <w:hyperlink w:anchor="_Toc229053052" w:history="1">
+          <w:hyperlink w:anchor="_Toc229054388" w:history="1">
             <w:r>
               <w:rPr>
                 <w:rStyle w:val="Hipervnculo"/>
@@ -2968,7 +2964,7 @@
                 <w:noProof/>
                 <w:webHidden/>
               </w:rPr>
-              <w:instrText xml:space="preserve"> PAGEREF _Toc229053052 \h </w:instrText>
+              <w:instrText xml:space="preserve"> PAGEREF _Toc229054388 \h </w:instrText>
             </w:r>
             <w:r>
               <w:rPr>
@@ -3014,7 +3010,7 @@
               <w14:ligatures w14:val="standardContextual"/>
             </w:rPr>
           </w:pPr>
-          <w:hyperlink w:anchor="_Toc229053053" w:history="1">
+          <w:hyperlink w:anchor="_Toc229054389" w:history="1">
             <w:r>
               <w:rPr>
                 <w:rStyle w:val="Hipervnculo"/>
@@ -3041,7 +3037,7 @@
                 <w:noProof/>
                 <w:webHidden/>
               </w:rPr>
-              <w:instrText xml:space="preserve"> PAGEREF _Toc229053053 \h </w:instrText>
+              <w:instrText xml:space="preserve"> PAGEREF _Toc229054389 \h </w:instrText>
             </w:r>
             <w:r>
               <w:rPr>
@@ -3087,7 +3083,7 @@
               <w14:ligatures w14:val="standardContextual"/>
             </w:rPr>
           </w:pPr>
-          <w:hyperlink w:anchor="_Toc229053054" w:history="1">
+          <w:hyperlink w:anchor="_Toc229054390" w:history="1">
             <w:r>
               <w:rPr>
                 <w:rStyle w:val="Hipervnculo"/>
@@ -3114,7 +3110,7 @@
                 <w:noProof/>
                 <w:webHidden/>
               </w:rPr>
-              <w:instrText xml:space="preserve"> PAGEREF _Toc229053054 \h </w:instrText>
+              <w:instrText xml:space="preserve"> PAGEREF _Toc229054390 \h </w:instrText>
             </w:r>
             <w:r>
               <w:rPr>
@@ -3160,7 +3156,7 @@
               <w14:ligatures w14:val="standardContextual"/>
             </w:rPr>
           </w:pPr>
-          <w:hyperlink w:anchor="_Toc229053055" w:history="1">
+          <w:hyperlink w:anchor="_Toc229054391" w:history="1">
             <w:r>
               <w:rPr>
                 <w:rStyle w:val="Hipervnculo"/>
@@ -3187,7 +3183,7 @@
                 <w:noProof/>
                 <w:webHidden/>
               </w:rPr>
-              <w:instrText xml:space="preserve"> PAGEREF _Toc229053055 \h </w:instrText>
+              <w:instrText xml:space="preserve"> PAGEREF _Toc229054391 \h </w:instrText>
             </w:r>
             <w:r>
               <w:rPr>
@@ -3233,7 +3229,7 @@
               <w14:ligatures w14:val="standardContextual"/>
             </w:rPr>
           </w:pPr>
-          <w:hyperlink w:anchor="_Toc229053056" w:history="1">
+          <w:hyperlink w:anchor="_Toc229054392" w:history="1">
             <w:r>
               <w:rPr>
                 <w:rStyle w:val="Hipervnculo"/>
@@ -3260,7 +3256,7 @@
                 <w:noProof/>
                 <w:webHidden/>
               </w:rPr>
-              <w:instrText xml:space="preserve"> PAGEREF _Toc229053056 \h </w:instrText>
+              <w:instrText xml:space="preserve"> PAGEREF _Toc229054392 \h </w:instrText>
             </w:r>
             <w:r>
               <w:rPr>
@@ -3306,7 +3302,7 @@
               <w14:ligatures w14:val="standardContextual"/>
             </w:rPr>
           </w:pPr>
-          <w:hyperlink w:anchor="_Toc229053057" w:history="1">
+          <w:hyperlink w:anchor="_Toc229054393" w:history="1">
             <w:r>
               <w:rPr>
                 <w:rStyle w:val="Hipervnculo"/>
@@ -3333,7 +3329,7 @@
                 <w:noProof/>
                 <w:webHidden/>
               </w:rPr>
-              <w:instrText xml:space="preserve"> PAGEREF _Toc229053057 \h </w:instrText>
+              <w:instrText xml:space="preserve"> PAGEREF _Toc229054393 \h </w:instrText>
             </w:r>
             <w:r>
               <w:rPr>
@@ -3379,7 +3375,7 @@
               <w14:ligatures w14:val="standardContextual"/>
             </w:rPr>
           </w:pPr>
-          <w:hyperlink w:anchor="_Toc229053058" w:history="1">
+          <w:hyperlink w:anchor="_Toc229054394" w:history="1">
             <w:r>
               <w:rPr>
                 <w:rStyle w:val="Hipervnculo"/>
@@ -3406,7 +3402,7 @@
                 <w:noProof/>
                 <w:webHidden/>
               </w:rPr>
-              <w:instrText xml:space="preserve"> PAGEREF _Toc229053058 \h </w:instrText>
+              <w:instrText xml:space="preserve"> PAGEREF _Toc229054394 \h </w:instrText>
             </w:r>
             <w:r>
               <w:rPr>
@@ -3452,7 +3448,7 @@
               <w14:ligatures w14:val="standardContextual"/>
             </w:rPr>
           </w:pPr>
-          <w:hyperlink w:anchor="_Toc229053059" w:history="1">
+          <w:hyperlink w:anchor="_Toc229054395" w:history="1">
             <w:r>
               <w:rPr>
                 <w:rStyle w:val="Hipervnculo"/>
@@ -3479,7 +3475,7 @@
                 <w:noProof/>
                 <w:webHidden/>
               </w:rPr>
-              <w:instrText xml:space="preserve"> PAGEREF _Toc229053059 \h </w:instrText>
+              <w:instrText xml:space="preserve"> PAGEREF _Toc229054395 \h </w:instrText>
             </w:r>
             <w:r>
               <w:rPr>
@@ -3527,7 +3523,7 @@
               <w14:ligatures w14:val="standardContextual"/>
             </w:rPr>
           </w:pPr>
-          <w:hyperlink w:anchor="_Toc229053060" w:history="1">
+          <w:hyperlink w:anchor="_Toc229054396" w:history="1">
             <w:r>
               <w:rPr>
                 <w:rStyle w:val="Hipervnculo"/>
@@ -3554,7 +3550,7 @@
                 <w:noProof/>
                 <w:webHidden/>
               </w:rPr>
-              <w:instrText xml:space="preserve"> PAGEREF _Toc229053060 \h </w:instrText>
+              <w:instrText xml:space="preserve"> PAGEREF _Toc229054396 \h </w:instrText>
             </w:r>
             <w:r>
               <w:rPr>
@@ -3602,7 +3598,7 @@
               <w14:ligatures w14:val="standardContextual"/>
             </w:rPr>
           </w:pPr>
-          <w:hyperlink w:anchor="_Toc229053061" w:history="1">
+          <w:hyperlink w:anchor="_Toc229054397" w:history="1">
             <w:r>
               <w:rPr>
                 <w:rStyle w:val="Hipervnculo"/>
@@ -3629,7 +3625,7 @@
                 <w:noProof/>
                 <w:webHidden/>
               </w:rPr>
-              <w:instrText xml:space="preserve"> PAGEREF _Toc229053061 \h </w:instrText>
+              <w:instrText xml:space="preserve"> PAGEREF _Toc229054397 \h </w:instrText>
             </w:r>
             <w:r>
               <w:rPr>
@@ -3677,7 +3673,7 @@
               <w14:ligatures w14:val="standardContextual"/>
             </w:rPr>
           </w:pPr>
-          <w:hyperlink w:anchor="_Toc229053062" w:history="1">
+          <w:hyperlink w:anchor="_Toc229054398" w:history="1">
             <w:r>
               <w:rPr>
                 <w:rStyle w:val="Hipervnculo"/>
@@ -3704,7 +3700,7 @@
                 <w:noProof/>
                 <w:webHidden/>
               </w:rPr>
-              <w:instrText xml:space="preserve"> PAGEREF _Toc229053062 \h </w:instrText>
+              <w:instrText xml:space="preserve"> PAGEREF _Toc229054398 \h </w:instrText>
             </w:r>
             <w:r>
               <w:rPr>
@@ -3750,7 +3746,7 @@
               <w14:ligatures w14:val="standardContextual"/>
             </w:rPr>
           </w:pPr>
-          <w:hyperlink w:anchor="_Toc229053063" w:history="1">
+          <w:hyperlink w:anchor="_Toc229054399" w:history="1">
             <w:r>
               <w:rPr>
                 <w:rStyle w:val="Hipervnculo"/>
@@ -3777,7 +3773,7 @@
                 <w:noProof/>
                 <w:webHidden/>
               </w:rPr>
-              <w:instrText xml:space="preserve"> PAGEREF _Toc229053063 \h </w:instrText>
+              <w:instrText xml:space="preserve"> PAGEREF _Toc229054399 \h </w:instrText>
             </w:r>
             <w:r>
               <w:rPr>
@@ -3823,7 +3819,7 @@
               <w14:ligatures w14:val="standardContextual"/>
             </w:rPr>
           </w:pPr>
-          <w:hyperlink w:anchor="_Toc229053064" w:history="1">
+          <w:hyperlink w:anchor="_Toc229054400" w:history="1">
             <w:r>
               <w:rPr>
                 <w:rStyle w:val="Hipervnculo"/>
@@ -3850,7 +3846,7 @@
                 <w:noProof/>
                 <w:webHidden/>
               </w:rPr>
-              <w:instrText xml:space="preserve"> PAGEREF _Toc229053064 \h </w:instrText>
+              <w:instrText xml:space="preserve"> PAGEREF _Toc229054400 \h </w:instrText>
             </w:r>
             <w:r>
               <w:rPr>
@@ -3896,7 +3892,7 @@
               <w14:ligatures w14:val="standardContextual"/>
             </w:rPr>
           </w:pPr>
-          <w:hyperlink w:anchor="_Toc229053065" w:history="1">
+          <w:hyperlink w:anchor="_Toc229054401" w:history="1">
             <w:r>
               <w:rPr>
                 <w:rStyle w:val="Hipervnculo"/>
@@ -3923,7 +3919,7 @@
                 <w:noProof/>
                 <w:webHidden/>
               </w:rPr>
-              <w:instrText xml:space="preserve"> PAGEREF _Toc229053065 \h </w:instrText>
+              <w:instrText xml:space="preserve"> PAGEREF _Toc229054401 \h </w:instrText>
             </w:r>
             <w:r>
               <w:rPr>
@@ -3969,7 +3965,7 @@
               <w14:ligatures w14:val="standardContextual"/>
             </w:rPr>
           </w:pPr>
-          <w:hyperlink w:anchor="_Toc229053066" w:history="1">
+          <w:hyperlink w:anchor="_Toc229054402" w:history="1">
             <w:r>
               <w:rPr>
                 <w:rStyle w:val="Hipervnculo"/>
@@ -3996,7 +3992,7 @@
                 <w:noProof/>
                 <w:webHidden/>
               </w:rPr>
-              <w:instrText xml:space="preserve"> PAGEREF _Toc229053066 \h </w:instrText>
+              <w:instrText xml:space="preserve"> PAGEREF _Toc229054402 \h </w:instrText>
             </w:r>
             <w:r>
               <w:rPr>
@@ -4042,7 +4038,7 @@
               <w14:ligatures w14:val="standardContextual"/>
             </w:rPr>
           </w:pPr>
-          <w:hyperlink w:anchor="_Toc229053067" w:history="1">
+          <w:hyperlink w:anchor="_Toc229054403" w:history="1">
             <w:r>
               <w:rPr>
                 <w:rStyle w:val="Hipervnculo"/>
@@ -4069,7 +4065,7 @@
                 <w:noProof/>
                 <w:webHidden/>
               </w:rPr>
-              <w:instrText xml:space="preserve"> PAGEREF _Toc229053067 \h </w:instrText>
+              <w:instrText xml:space="preserve"> PAGEREF _Toc229054403 \h </w:instrText>
             </w:r>
             <w:r>
               <w:rPr>
@@ -4115,7 +4111,7 @@
               <w14:ligatures w14:val="standardContextual"/>
             </w:rPr>
           </w:pPr>
-          <w:hyperlink w:anchor="_Toc229053068" w:history="1">
+          <w:hyperlink w:anchor="_Toc229054404" w:history="1">
             <w:r>
               <w:rPr>
                 <w:rStyle w:val="Hipervnculo"/>
@@ -4142,7 +4138,7 @@
                 <w:noProof/>
                 <w:webHidden/>
               </w:rPr>
-              <w:instrText xml:space="preserve"> PAGEREF _Toc229053068 \h </w:instrText>
+              <w:instrText xml:space="preserve"> PAGEREF _Toc229054404 \h </w:instrText>
             </w:r>
             <w:r>
               <w:rPr>
@@ -4188,7 +4184,7 @@
               <w14:ligatures w14:val="standardContextual"/>
             </w:rPr>
           </w:pPr>
-          <w:hyperlink w:anchor="_Toc229053069" w:history="1">
+          <w:hyperlink w:anchor="_Toc229054405" w:history="1">
             <w:r>
               <w:rPr>
                 <w:rStyle w:val="Hipervnculo"/>
@@ -4215,7 +4211,7 @@
                 <w:noProof/>
                 <w:webHidden/>
               </w:rPr>
-              <w:instrText xml:space="preserve"> PAGEREF _Toc229053069 \h </w:instrText>
+              <w:instrText xml:space="preserve"> PAGEREF _Toc229054405 \h </w:instrText>
             </w:r>
             <w:r>
               <w:rPr>
@@ -4261,7 +4257,7 @@
               <w14:ligatures w14:val="standardContextual"/>
             </w:rPr>
           </w:pPr>
-          <w:hyperlink w:anchor="_Toc229053070" w:history="1">
+          <w:hyperlink w:anchor="_Toc229054406" w:history="1">
             <w:r>
               <w:rPr>
                 <w:rStyle w:val="Hipervnculo"/>
@@ -4288,7 +4284,7 @@
                 <w:noProof/>
                 <w:webHidden/>
               </w:rPr>
-              <w:instrText xml:space="preserve"> PAGEREF _Toc229053070 \h </w:instrText>
+              <w:instrText xml:space="preserve"> PAGEREF _Toc229054406 \h </w:instrText>
             </w:r>
             <w:r>
               <w:rPr>
@@ -4334,7 +4330,7 @@
               <w14:ligatures w14:val="standardContextual"/>
             </w:rPr>
           </w:pPr>
-          <w:hyperlink w:anchor="_Toc229053071" w:history="1">
+          <w:hyperlink w:anchor="_Toc229054407" w:history="1">
             <w:r>
               <w:rPr>
                 <w:rStyle w:val="Hipervnculo"/>
@@ -4361,7 +4357,7 @@
                 <w:noProof/>
                 <w:webHidden/>
               </w:rPr>
-              <w:instrText xml:space="preserve"> PAGEREF _Toc229053071 \h </w:instrText>
+              <w:instrText xml:space="preserve"> PAGEREF _Toc229054407 \h </w:instrText>
             </w:r>
             <w:r>
               <w:rPr>
@@ -4407,7 +4403,7 @@
               <w14:ligatures w14:val="standardContextual"/>
             </w:rPr>
           </w:pPr>
-          <w:hyperlink w:anchor="_Toc229053072" w:history="1">
+          <w:hyperlink w:anchor="_Toc229054408" w:history="1">
             <w:r>
               <w:rPr>
                 <w:rStyle w:val="Hipervnculo"/>
@@ -4434,7 +4430,7 @@
                 <w:noProof/>
                 <w:webHidden/>
               </w:rPr>
-              <w:instrText xml:space="preserve"> PAGEREF _Toc229053072 \h </w:instrText>
+              <w:instrText xml:space="preserve"> PAGEREF _Toc229054408 \h </w:instrText>
             </w:r>
             <w:r>
               <w:rPr>
@@ -4480,7 +4476,7 @@
               <w14:ligatures w14:val="standardContextual"/>
             </w:rPr>
           </w:pPr>
-          <w:hyperlink w:anchor="_Toc229053073" w:history="1">
+          <w:hyperlink w:anchor="_Toc229054409" w:history="1">
             <w:r>
               <w:rPr>
                 <w:rStyle w:val="Hipervnculo"/>
@@ -4507,7 +4503,7 @@
                 <w:noProof/>
                 <w:webHidden/>
               </w:rPr>
-              <w:instrText xml:space="preserve"> PAGEREF _Toc229053073 \h </w:instrText>
+              <w:instrText xml:space="preserve"> PAGEREF _Toc229054409 \h </w:instrText>
             </w:r>
             <w:r>
               <w:rPr>
@@ -4555,7 +4551,7 @@
               <w14:ligatures w14:val="standardContextual"/>
             </w:rPr>
           </w:pPr>
-          <w:hyperlink w:anchor="_Toc229053074" w:history="1">
+          <w:hyperlink w:anchor="_Toc229054410" w:history="1">
             <w:r>
               <w:rPr>
                 <w:rStyle w:val="Hipervnculo"/>
@@ -4582,7 +4578,7 @@
                 <w:noProof/>
                 <w:webHidden/>
               </w:rPr>
-              <w:instrText xml:space="preserve"> PAGEREF _Toc229053074 \h </w:instrText>
+              <w:instrText xml:space="preserve"> PAGEREF _Toc229054410 \h </w:instrText>
             </w:r>
             <w:r>
               <w:rPr>
@@ -4630,7 +4626,7 @@
               <w14:ligatures w14:val="standardContextual"/>
             </w:rPr>
           </w:pPr>
-          <w:hyperlink w:anchor="_Toc229053075" w:history="1">
+          <w:hyperlink w:anchor="_Toc229054411" w:history="1">
             <w:r>
               <w:rPr>
                 <w:rStyle w:val="Hipervnculo"/>
@@ -4657,7 +4653,7 @@
                 <w:noProof/>
                 <w:webHidden/>
               </w:rPr>
-              <w:instrText xml:space="preserve"> PAGEREF _Toc229053075 \h </w:instrText>
+              <w:instrText xml:space="preserve"> PAGEREF _Toc229054411 \h </w:instrText>
             </w:r>
             <w:r>
               <w:rPr>
@@ -4705,7 +4701,7 @@
               <w14:ligatures w14:val="standardContextual"/>
             </w:rPr>
           </w:pPr>
-          <w:hyperlink w:anchor="_Toc229053076" w:history="1">
+          <w:hyperlink w:anchor="_Toc229054412" w:history="1">
             <w:r>
               <w:rPr>
                 <w:rStyle w:val="Hipervnculo"/>
@@ -4732,7 +4728,7 @@
                 <w:noProof/>
                 <w:webHidden/>
               </w:rPr>
-              <w:instrText xml:space="preserve"> PAGEREF _Toc229053076 \h </w:instrText>
+              <w:instrText xml:space="preserve"> PAGEREF _Toc229054412 \h </w:instrText>
             </w:r>
             <w:r>
               <w:rPr>
@@ -4780,7 +4776,7 @@
               <w14:ligatures w14:val="standardContextual"/>
             </w:rPr>
           </w:pPr>
-          <w:hyperlink w:anchor="_Toc229053077" w:history="1">
+          <w:hyperlink w:anchor="_Toc229054413" w:history="1">
             <w:r>
               <w:rPr>
                 <w:rStyle w:val="Hipervnculo"/>
@@ -4807,7 +4803,7 @@
                 <w:noProof/>
                 <w:webHidden/>
               </w:rPr>
-              <w:instrText xml:space="preserve"> PAGEREF _Toc229053077 \h </w:instrText>
+              <w:instrText xml:space="preserve"> PAGEREF _Toc229054413 \h </w:instrText>
             </w:r>
             <w:r>
               <w:rPr>
@@ -4855,7 +4851,7 @@
               <w14:ligatures w14:val="standardContextual"/>
             </w:rPr>
           </w:pPr>
-          <w:hyperlink w:anchor="_Toc229053078" w:history="1">
+          <w:hyperlink w:anchor="_Toc229054414" w:history="1">
             <w:r>
               <w:rPr>
                 <w:rStyle w:val="Hipervnculo"/>
@@ -4882,7 +4878,7 @@
                 <w:noProof/>
                 <w:webHidden/>
               </w:rPr>
-              <w:instrText xml:space="preserve"> PAGEREF _Toc229053078 \h </w:instrText>
+              <w:instrText xml:space="preserve"> PAGEREF _Toc229054414 \h </w:instrText>
             </w:r>
             <w:r>
               <w:rPr>
@@ -4930,7 +4926,7 @@
               <w14:ligatures w14:val="standardContextual"/>
             </w:rPr>
           </w:pPr>
-          <w:hyperlink w:anchor="_Toc229053079" w:history="1">
+          <w:hyperlink w:anchor="_Toc229054415" w:history="1">
             <w:r>
               <w:rPr>
                 <w:rStyle w:val="Hipervnculo"/>
@@ -4957,7 +4953,7 @@
                 <w:noProof/>
                 <w:webHidden/>
               </w:rPr>
-              <w:instrText xml:space="preserve"> PAGEREF _Toc229053079 \h </w:instrText>
+              <w:instrText xml:space="preserve"> PAGEREF _Toc229054415 \h </w:instrText>
             </w:r>
             <w:r>
               <w:rPr>
@@ -5005,7 +5001,7 @@
               <w14:ligatures w14:val="standardContextual"/>
             </w:rPr>
           </w:pPr>
-          <w:hyperlink w:anchor="_Toc229053080" w:history="1">
+          <w:hyperlink w:anchor="_Toc229054416" w:history="1">
             <w:r>
               <w:rPr>
                 <w:rStyle w:val="Hipervnculo"/>
@@ -5032,7 +5028,7 @@
                 <w:noProof/>
                 <w:webHidden/>
               </w:rPr>
-              <w:instrText xml:space="preserve"> PAGEREF _Toc229053080 \h </w:instrText>
+              <w:instrText xml:space="preserve"> PAGEREF _Toc229054416 \h </w:instrText>
             </w:r>
             <w:r>
               <w:rPr>
@@ -5078,7 +5074,7 @@
               <w14:ligatures w14:val="standardContextual"/>
             </w:rPr>
           </w:pPr>
-          <w:hyperlink w:anchor="_Toc229053081" w:history="1">
+          <w:hyperlink w:anchor="_Toc229054417" w:history="1">
             <w:r>
               <w:rPr>
                 <w:rStyle w:val="Hipervnculo"/>
@@ -5105,7 +5101,7 @@
                 <w:noProof/>
                 <w:webHidden/>
               </w:rPr>
-              <w:instrText xml:space="preserve"> PAGEREF _Toc229053081 \h </w:instrText>
+              <w:instrText xml:space="preserve"> PAGEREF _Toc229054417 \h </w:instrText>
             </w:r>
             <w:r>
               <w:rPr>
@@ -5151,7 +5147,7 @@
               <w14:ligatures w14:val="standardContextual"/>
             </w:rPr>
           </w:pPr>
-          <w:hyperlink w:anchor="_Toc229053082" w:history="1">
+          <w:hyperlink w:anchor="_Toc229054418" w:history="1">
             <w:r>
               <w:rPr>
                 <w:rStyle w:val="Hipervnculo"/>
@@ -5178,7 +5174,7 @@
                 <w:noProof/>
                 <w:webHidden/>
               </w:rPr>
-              <w:instrText xml:space="preserve"> PAGEREF _Toc229053082 \h </w:instrText>
+              <w:instrText xml:space="preserve"> PAGEREF _Toc229054418 \h </w:instrText>
             </w:r>
             <w:r>
               <w:rPr>
@@ -5224,7 +5220,7 @@
               <w14:ligatures w14:val="standardContextual"/>
             </w:rPr>
           </w:pPr>
-          <w:hyperlink w:anchor="_Toc229053083" w:history="1">
+          <w:hyperlink w:anchor="_Toc229054419" w:history="1">
             <w:r>
               <w:rPr>
                 <w:rStyle w:val="Hipervnculo"/>
@@ -5251,7 +5247,7 @@
                 <w:noProof/>
                 <w:webHidden/>
               </w:rPr>
-              <w:instrText xml:space="preserve"> PAGEREF _Toc229053083 \h </w:instrText>
+              <w:instrText xml:space="preserve"> PAGEREF _Toc229054419 \h </w:instrText>
             </w:r>
             <w:r>
               <w:rPr>
@@ -5299,7 +5295,7 @@
               <w14:ligatures w14:val="standardContextual"/>
             </w:rPr>
           </w:pPr>
-          <w:hyperlink w:anchor="_Toc229053084" w:history="1">
+          <w:hyperlink w:anchor="_Toc229054420" w:history="1">
             <w:r>
               <w:rPr>
                 <w:rStyle w:val="Hipervnculo"/>
@@ -5326,7 +5322,7 @@
                 <w:noProof/>
                 <w:webHidden/>
               </w:rPr>
-              <w:instrText xml:space="preserve"> PAGEREF _Toc229053084 \h </w:instrText>
+              <w:instrText xml:space="preserve"> PAGEREF _Toc229054420 \h </w:instrText>
             </w:r>
             <w:r>
               <w:rPr>
@@ -5374,7 +5370,7 @@
               <w14:ligatures w14:val="standardContextual"/>
             </w:rPr>
           </w:pPr>
-          <w:hyperlink w:anchor="_Toc229053085" w:history="1">
+          <w:hyperlink w:anchor="_Toc229054421" w:history="1">
             <w:r>
               <w:rPr>
                 <w:rStyle w:val="Hipervnculo"/>
@@ -5401,7 +5397,7 @@
                 <w:noProof/>
                 <w:webHidden/>
               </w:rPr>
-              <w:instrText xml:space="preserve"> PAGEREF _Toc229053085 \h </w:instrText>
+              <w:instrText xml:space="preserve"> PAGEREF _Toc229054421 \h </w:instrText>
             </w:r>
             <w:r>
               <w:rPr>
@@ -5449,13 +5445,13 @@
               <w14:ligatures w14:val="standardContextual"/>
             </w:rPr>
           </w:pPr>
-          <w:hyperlink w:anchor="_Toc229053086" w:history="1">
+          <w:hyperlink w:anchor="_Toc229054422" w:history="1">
             <w:r>
               <w:rPr>
                 <w:rStyle w:val="Hipervnculo"/>
                 <w:noProof/>
               </w:rPr>
-              <w:t>12. Tablas resumen tarifas Decreto 29/2018, de 17 de abril</w:t>
+              <w:t>12. Tablas resumen tarifas Decreto 29/2018, de 17 de abril y de la Orden 1330/2018</w:t>
             </w:r>
             <w:r>
               <w:rPr>
@@ -5476,7 +5472,7 @@
                 <w:noProof/>
                 <w:webHidden/>
               </w:rPr>
-              <w:instrText xml:space="preserve"> PAGEREF _Toc229053086 \h </w:instrText>
+              <w:instrText xml:space="preserve"> PAGEREF _Toc229054422 \h </w:instrText>
             </w:r>
             <w:r>
               <w:rPr>
@@ -5543,7 +5539,7 @@
         <w:shd w:val="clear" w:color="auto" w:fill="1F3864"/>
         <w:ind w:left="200" w:right="200"/>
       </w:pPr>
-      <w:bookmarkStart w:id="0" w:name="_Toc229053015"/>
+      <w:bookmarkStart w:id="0" w:name="_Toc229054351"/>
       <w:r>
         <w:lastRenderedPageBreak/>
         <w:t>1. DECRETO 2922/1975, de 31 de octubre</w:t>
@@ -5889,7 +5885,7 @@
         <w:shd w:val="clear" w:color="auto" w:fill="2E75B6"/>
         <w:ind w:left="200"/>
       </w:pPr>
-      <w:bookmarkStart w:id="1" w:name="_Toc229053016"/>
+      <w:bookmarkStart w:id="1" w:name="_Toc229054352"/>
       <w:r>
         <w:t>CAPÍTULO I — Ámbito de aplicación</w:t>
       </w:r>
@@ -5952,7 +5948,7 @@
         <w:shd w:val="clear" w:color="auto" w:fill="2E75B6"/>
         <w:ind w:left="200"/>
       </w:pPr>
-      <w:bookmarkStart w:id="2" w:name="_Toc229053017"/>
+      <w:bookmarkStart w:id="2" w:name="_Toc229054353"/>
       <w:r>
         <w:t>CAPÍTULO II — Condiciones del suministro</w:t>
       </w:r>
@@ -6117,7 +6113,7 @@
         <w:shd w:val="clear" w:color="auto" w:fill="2E75B6"/>
         <w:ind w:left="200"/>
       </w:pPr>
-      <w:bookmarkStart w:id="3" w:name="_Toc229053018"/>
+      <w:bookmarkStart w:id="3" w:name="_Toc229054354"/>
       <w:r>
         <w:t>CAPÍTULO III — Red de distribución</w:t>
       </w:r>
@@ -6231,7 +6227,7 @@
         <w:shd w:val="clear" w:color="auto" w:fill="2E75B6"/>
         <w:ind w:left="200"/>
       </w:pPr>
-      <w:bookmarkStart w:id="4" w:name="_Toc229053019"/>
+      <w:bookmarkStart w:id="4" w:name="_Toc229054355"/>
       <w:r>
         <w:t>CAPÍTULO IV — Contratación del suministro</w:t>
       </w:r>
@@ -6404,7 +6400,7 @@
         <w:shd w:val="clear" w:color="auto" w:fill="2E75B6"/>
         <w:ind w:left="200"/>
       </w:pPr>
-      <w:bookmarkStart w:id="5" w:name="_Toc229053020"/>
+      <w:bookmarkStart w:id="5" w:name="_Toc229054356"/>
       <w:r>
         <w:t>CAPÍTULO V — Acometidas</w:t>
       </w:r>
@@ -6522,7 +6518,7 @@
         <w:shd w:val="clear" w:color="auto" w:fill="2E75B6"/>
         <w:ind w:left="200"/>
       </w:pPr>
-      <w:bookmarkStart w:id="6" w:name="_Toc229053021"/>
+      <w:bookmarkStart w:id="6" w:name="_Toc229054357"/>
       <w:r>
         <w:t>CAPÍTULO VI — Facturación, cobro e información</w:t>
       </w:r>
@@ -6708,7 +6704,7 @@
         <w:shd w:val="clear" w:color="auto" w:fill="2E75B6"/>
         <w:ind w:left="200"/>
       </w:pPr>
-      <w:bookmarkStart w:id="7" w:name="_Toc229053022"/>
+      <w:bookmarkStart w:id="7" w:name="_Toc229054358"/>
       <w:r>
         <w:t>CAPÍTULO VII — Suministros singulares – Láminas</w:t>
       </w:r>
@@ -6788,7 +6784,7 @@
         <w:shd w:val="clear" w:color="auto" w:fill="2E75B6"/>
         <w:ind w:left="200"/>
       </w:pPr>
-      <w:bookmarkStart w:id="8" w:name="_Toc229053023"/>
+      <w:bookmarkStart w:id="8" w:name="_Toc229054359"/>
       <w:r>
         <w:t>CAPÍTULO VIII — Infracciones</w:t>
       </w:r>
@@ -6918,7 +6914,7 @@
         <w:shd w:val="clear" w:color="auto" w:fill="1F3864"/>
         <w:ind w:left="200" w:right="200"/>
       </w:pPr>
-      <w:bookmarkStart w:id="9" w:name="_Toc229053024"/>
+      <w:bookmarkStart w:id="9" w:name="_Toc229054360"/>
       <w:r>
         <w:lastRenderedPageBreak/>
         <w:t>2. DECRETO 3068/1975, de 31 de octubre</w:t>
@@ -7264,7 +7260,7 @@
         <w:shd w:val="clear" w:color="auto" w:fill="2E75B6"/>
         <w:ind w:left="200"/>
       </w:pPr>
-      <w:bookmarkStart w:id="10" w:name="_Toc229053025"/>
+      <w:bookmarkStart w:id="10" w:name="_Toc229054361"/>
       <w:r>
         <w:t>Artículos principales</w:t>
       </w:r>
@@ -7554,7 +7550,7 @@
         <w:shd w:val="clear" w:color="auto" w:fill="1F3864"/>
         <w:ind w:left="200" w:right="200"/>
       </w:pPr>
-      <w:bookmarkStart w:id="11" w:name="_Toc229053026"/>
+      <w:bookmarkStart w:id="11" w:name="_Toc229054362"/>
       <w:r>
         <w:lastRenderedPageBreak/>
         <w:t>3. DECRETO 137/1985, de 20 de diciembre</w:t>
@@ -7886,7 +7882,7 @@
         <w:shd w:val="clear" w:color="auto" w:fill="2E75B6"/>
         <w:ind w:left="200"/>
       </w:pPr>
-      <w:bookmarkStart w:id="12" w:name="_Toc229053027"/>
+      <w:bookmarkStart w:id="12" w:name="_Toc229054363"/>
       <w:r>
         <w:t>CAPÍTULO I — Régimen de Tarifas</w:t>
       </w:r>
@@ -7899,7 +7895,7 @@
           <w:bottom w:val="single" w:sz="2" w:space="0" w:color="D6E4F0"/>
         </w:pBdr>
       </w:pPr>
-      <w:bookmarkStart w:id="13" w:name="_Toc229053028"/>
+      <w:bookmarkStart w:id="13" w:name="_Toc229054364"/>
       <w:r>
         <w:t>Sección 1ª. Disposiciones generales</w:t>
       </w:r>
@@ -7997,7 +7993,7 @@
           <w:bottom w:val="single" w:sz="2" w:space="0" w:color="D6E4F0"/>
         </w:pBdr>
       </w:pPr>
-      <w:bookmarkStart w:id="14" w:name="_Toc229053029"/>
+      <w:bookmarkStart w:id="14" w:name="_Toc229054365"/>
       <w:r>
         <w:t>Sección 2ª. Cuota suplementaria</w:t>
       </w:r>
@@ -8060,7 +8056,7 @@
         <w:shd w:val="clear" w:color="auto" w:fill="2E75B6"/>
         <w:ind w:left="200"/>
       </w:pPr>
-      <w:bookmarkStart w:id="15" w:name="_Toc229053030"/>
+      <w:bookmarkStart w:id="15" w:name="_Toc229054366"/>
       <w:r>
         <w:lastRenderedPageBreak/>
         <w:t>CAPÍTULO II — Recaudación y cobro</w:t>
@@ -8074,7 +8070,7 @@
           <w:bottom w:val="single" w:sz="2" w:space="0" w:color="D6E4F0"/>
         </w:pBdr>
       </w:pPr>
-      <w:bookmarkStart w:id="16" w:name="_Toc229053031"/>
+      <w:bookmarkStart w:id="16" w:name="_Toc229054367"/>
       <w:r>
         <w:t>Sección 1ª. Factura y recibo único</w:t>
       </w:r>
@@ -8155,7 +8151,7 @@
           <w:bottom w:val="single" w:sz="2" w:space="0" w:color="D6E4F0"/>
         </w:pBdr>
       </w:pPr>
-      <w:bookmarkStart w:id="17" w:name="_Toc229053032"/>
+      <w:bookmarkStart w:id="17" w:name="_Toc229054368"/>
       <w:r>
         <w:t>Sección 2ª. Gestión de los servicios</w:t>
       </w:r>
@@ -8356,7 +8352,7 @@
         <w:shd w:val="clear" w:color="auto" w:fill="1F3864"/>
         <w:ind w:left="200" w:right="200"/>
       </w:pPr>
-      <w:bookmarkStart w:id="18" w:name="_Toc229053033"/>
+      <w:bookmarkStart w:id="18" w:name="_Toc229054369"/>
       <w:r>
         <w:lastRenderedPageBreak/>
         <w:t>4. LEY 17/1984, de 20 de diciembre</w:t>
@@ -8746,7 +8742,7 @@
         <w:shd w:val="clear" w:color="auto" w:fill="2E75B6"/>
         <w:ind w:left="200"/>
       </w:pPr>
-      <w:bookmarkStart w:id="19" w:name="_Toc229053034"/>
+      <w:bookmarkStart w:id="19" w:name="_Toc229054370"/>
       <w:r>
         <w:t>CAPÍTULO I — Disposiciones generales</w:t>
       </w:r>
@@ -8955,7 +8951,7 @@
         <w:shd w:val="clear" w:color="auto" w:fill="2E75B6"/>
         <w:ind w:left="200"/>
       </w:pPr>
-      <w:bookmarkStart w:id="20" w:name="_Toc229053035"/>
+      <w:bookmarkStart w:id="20" w:name="_Toc229054371"/>
       <w:r>
         <w:t>CAPÍTULO II — Organización</w:t>
       </w:r>
@@ -9053,7 +9049,7 @@
         <w:shd w:val="clear" w:color="auto" w:fill="2E75B6"/>
         <w:ind w:left="200"/>
       </w:pPr>
-      <w:bookmarkStart w:id="21" w:name="_Toc229053036"/>
+      <w:bookmarkStart w:id="21" w:name="_Toc229054372"/>
       <w:r>
         <w:t>CAPÍTULO III — Régimen económico-financiero</w:t>
       </w:r>
@@ -9212,7 +9208,7 @@
         <w:shd w:val="clear" w:color="auto" w:fill="1F3864"/>
         <w:ind w:left="200" w:right="200"/>
       </w:pPr>
-      <w:bookmarkStart w:id="22" w:name="_Toc229053037"/>
+      <w:bookmarkStart w:id="22" w:name="_Toc229054373"/>
       <w:r>
         <w:lastRenderedPageBreak/>
         <w:t>5. DECRETO 29/2018, de 17 de abril</w:t>
@@ -9558,7 +9554,7 @@
         <w:shd w:val="clear" w:color="auto" w:fill="2E75B6"/>
         <w:ind w:left="200"/>
       </w:pPr>
-      <w:bookmarkStart w:id="23" w:name="_Toc229053038"/>
+      <w:bookmarkStart w:id="23" w:name="_Toc229054374"/>
       <w:r>
         <w:t>Artículo 1 — Objeto y ámbito</w:t>
       </w:r>
@@ -9579,7 +9575,7 @@
         <w:shd w:val="clear" w:color="auto" w:fill="2E75B6"/>
         <w:ind w:left="200"/>
       </w:pPr>
-      <w:bookmarkStart w:id="24" w:name="_Toc229053039"/>
+      <w:bookmarkStart w:id="24" w:name="_Toc229054375"/>
       <w:r>
         <w:t>Artículo 2 — Definiciones</w:t>
       </w:r>
@@ -9690,7 +9686,7 @@
         <w:shd w:val="clear" w:color="auto" w:fill="2E75B6"/>
         <w:ind w:left="200"/>
       </w:pPr>
-      <w:bookmarkStart w:id="25" w:name="_Toc229053040"/>
+      <w:bookmarkStart w:id="25" w:name="_Toc229054376"/>
       <w:r>
         <w:t>Artículo 3 — Estructura de las tarifas</w:t>
       </w:r>
@@ -9711,7 +9707,7 @@
         <w:shd w:val="clear" w:color="auto" w:fill="2E75B6"/>
         <w:ind w:left="200"/>
       </w:pPr>
-      <w:bookmarkStart w:id="26" w:name="_Toc229053041"/>
+      <w:bookmarkStart w:id="26" w:name="_Toc229054377"/>
       <w:r>
         <w:t>Artículo 4 — Grupos de usos</w:t>
       </w:r>
@@ -9835,7 +9831,7 @@
         <w:shd w:val="clear" w:color="auto" w:fill="2E75B6"/>
         <w:ind w:left="200"/>
       </w:pPr>
-      <w:bookmarkStart w:id="27" w:name="_Toc229053042"/>
+      <w:bookmarkStart w:id="27" w:name="_Toc229054378"/>
       <w:r>
         <w:t>Artículos 5 y 6 — Cálculo de bloques y cuota de servicio</w:t>
       </w:r>
@@ -9856,7 +9852,7 @@
         <w:shd w:val="clear" w:color="auto" w:fill="2E75B6"/>
         <w:ind w:left="200"/>
       </w:pPr>
-      <w:bookmarkStart w:id="28" w:name="_Toc229053043"/>
+      <w:bookmarkStart w:id="28" w:name="_Toc229054379"/>
       <w:r>
         <w:t>Artículo 7 — Tarifas máximas (resumen)</w:t>
       </w:r>
@@ -10053,16 +10049,7 @@
           <w:szCs w:val="32"/>
           <w:u w:val="single"/>
         </w:rPr>
-        <w:t>1</w:t>
-      </w:r>
-      <w:r>
-        <w:rPr>
-          <w:color w:val="215E99" w:themeColor="text2" w:themeTint="BF"/>
-          <w:sz w:val="32"/>
-          <w:szCs w:val="32"/>
-          <w:u w:val="single"/>
-        </w:rPr>
-        <w:t>2</w:t>
+        <w:t>12</w:t>
       </w:r>
       <w:r>
         <w:rPr>
@@ -10082,16 +10069,7 @@
           <w:szCs w:val="32"/>
           <w:u w:val="single"/>
         </w:rPr>
-        <w:t xml:space="preserve"> Tablas resumen tarifas D</w:t>
-      </w:r>
-      <w:r>
-        <w:rPr>
-          <w:color w:val="215E99" w:themeColor="text2" w:themeTint="BF"/>
-          <w:sz w:val="32"/>
-          <w:szCs w:val="32"/>
-          <w:u w:val="single"/>
-        </w:rPr>
-        <w:t>ecreto 29/2018, de 17 de abril</w:t>
+        <w:t xml:space="preserve"> Tablas resumen tarifas Decreto 29/2018, de 17 de abril</w:t>
       </w:r>
       <w:r>
         <w:rPr>
@@ -10144,16 +10122,7 @@
           <w:szCs w:val="32"/>
           <w:u w:val="single"/>
         </w:rPr>
-        <w:t>1</w:t>
-      </w:r>
-      <w:r>
-        <w:rPr>
-          <w:color w:val="215E99" w:themeColor="text2" w:themeTint="BF"/>
-          <w:sz w:val="32"/>
-          <w:szCs w:val="32"/>
-          <w:u w:val="single"/>
-        </w:rPr>
-        <w:t>2</w:t>
+        <w:t>12</w:t>
       </w:r>
       <w:r>
         <w:rPr>
@@ -10173,34 +10142,7 @@
           <w:szCs w:val="32"/>
           <w:u w:val="single"/>
         </w:rPr>
-        <w:t xml:space="preserve"> Tablas resumen tarifas D</w:t>
-      </w:r>
-      <w:r>
-        <w:rPr>
-          <w:color w:val="215E99" w:themeColor="text2" w:themeTint="BF"/>
-          <w:sz w:val="32"/>
-          <w:szCs w:val="32"/>
-          <w:u w:val="single"/>
-        </w:rPr>
-        <w:t xml:space="preserve">ecreto 29/2018, de 17 de </w:t>
-      </w:r>
-      <w:r>
-        <w:rPr>
-          <w:color w:val="215E99" w:themeColor="text2" w:themeTint="BF"/>
-          <w:sz w:val="32"/>
-          <w:szCs w:val="32"/>
-          <w:u w:val="single"/>
-        </w:rPr>
-        <w:t>a</w:t>
-      </w:r>
-      <w:r>
-        <w:rPr>
-          <w:color w:val="215E99" w:themeColor="text2" w:themeTint="BF"/>
-          <w:sz w:val="32"/>
-          <w:szCs w:val="32"/>
-          <w:u w:val="single"/>
-        </w:rPr>
-        <w:t>bril</w:t>
+        <w:t xml:space="preserve"> Tablas resumen tarifas Decreto 29/2018, de 17 de abril</w:t>
       </w:r>
       <w:r>
         <w:rPr>
@@ -10235,7 +10177,7 @@
         <w:shd w:val="clear" w:color="auto" w:fill="1F3864"/>
         <w:ind w:left="200" w:right="200"/>
       </w:pPr>
-      <w:bookmarkStart w:id="29" w:name="_Toc229053044"/>
+      <w:bookmarkStart w:id="29" w:name="_Toc229054380"/>
       <w:r>
         <w:lastRenderedPageBreak/>
         <w:t>6. ORDEN 1330/2018, de 18 de abril</w:t>
@@ -10597,7 +10539,7 @@
         <w:shd w:val="clear" w:color="auto" w:fill="2E75B6"/>
         <w:ind w:left="200"/>
       </w:pPr>
-      <w:bookmarkStart w:id="30" w:name="_Toc229053045"/>
+      <w:bookmarkStart w:id="30" w:name="_Toc229054381"/>
       <w:r>
         <w:t>Puntos principales</w:t>
       </w:r>
@@ -11026,7 +10968,7 @@
         <w:shd w:val="clear" w:color="auto" w:fill="2E75B6"/>
         <w:ind w:left="200"/>
       </w:pPr>
-      <w:bookmarkStart w:id="31" w:name="_Toc229053046"/>
+      <w:bookmarkStart w:id="31" w:name="_Toc229054382"/>
       <w:r>
         <w:t>Bonificaciones</w:t>
       </w:r>
@@ -11039,7 +10981,7 @@
           <w:bottom w:val="single" w:sz="2" w:space="0" w:color="D6E4F0"/>
         </w:pBdr>
       </w:pPr>
-      <w:bookmarkStart w:id="32" w:name="_Toc229053047"/>
+      <w:bookmarkStart w:id="32" w:name="_Toc229054383"/>
       <w:r>
         <w:t xml:space="preserve">1. </w:t>
       </w:r>
@@ -11082,7 +11024,7 @@
           <w:bottom w:val="single" w:sz="2" w:space="0" w:color="D6E4F0"/>
         </w:pBdr>
       </w:pPr>
-      <w:bookmarkStart w:id="33" w:name="_Toc229053048"/>
+      <w:bookmarkStart w:id="33" w:name="_Toc229054384"/>
       <w:r>
         <w:t>2. Exención social</w:t>
       </w:r>
@@ -11116,7 +11058,7 @@
           <w:bottom w:val="single" w:sz="2" w:space="0" w:color="D6E4F0"/>
         </w:pBdr>
       </w:pPr>
-      <w:bookmarkStart w:id="34" w:name="_Toc229053049"/>
+      <w:bookmarkStart w:id="34" w:name="_Toc229054385"/>
       <w:r>
         <w:t>3. Bonificación por ahorro de consumo</w:t>
       </w:r>
@@ -11129,6 +11071,182 @@
       </w:pPr>
       <w:r>
         <w:t>Para usos domésticos o asimilados: si el consumo anual ha descendido respecto al año anterior, bonificación del 10% sobre el importe de la parte variable que supondría el volumen ahorrado, a precios del 1.º bloque. Solicitud durante el 2.º bimestre de cada año posterior. Para usos comerciales, industriales o asimilados a comercial: mismo 10%, aplicado durante 3 años posteriores a las actuaciones de ahorro, con solicitud en el 2.º bimestre del año siguiente al ahorro, aportando estudio técnico y justificantes económicos. No se aplica en casos de fuerza mayor (sequías, roturas estratégicas, etc.).</w:t>
+      </w:r>
+    </w:p>
+    <w:p>
+      <w:pPr>
+        <w:spacing w:before="80" w:after="80"/>
+        <w:ind w:left="360"/>
+        <w:rPr>
+          <w:color w:val="215E99" w:themeColor="text2" w:themeTint="BF"/>
+          <w:sz w:val="16"/>
+          <w:szCs w:val="16"/>
+          <w:u w:val="single"/>
+        </w:rPr>
+      </w:pPr>
+      <w:r>
+        <w:rPr>
+          <w:color w:val="215E99" w:themeColor="text2" w:themeTint="BF"/>
+          <w:sz w:val="32"/>
+          <w:szCs w:val="32"/>
+          <w:u w:val="single"/>
+        </w:rPr>
+        <w:fldChar w:fldCharType="begin"/>
+      </w:r>
+      <w:r>
+        <w:rPr>
+          <w:color w:val="215E99" w:themeColor="text2" w:themeTint="BF"/>
+          <w:sz w:val="32"/>
+          <w:szCs w:val="32"/>
+          <w:u w:val="single"/>
+        </w:rPr>
+        <w:instrText xml:space="preserve"> REF _Ref229052810 \h </w:instrText>
+      </w:r>
+      <w:r>
+        <w:rPr>
+          <w:color w:val="215E99" w:themeColor="text2" w:themeTint="BF"/>
+          <w:sz w:val="32"/>
+          <w:szCs w:val="32"/>
+          <w:u w:val="single"/>
+        </w:rPr>
+      </w:r>
+      <w:r>
+        <w:rPr>
+          <w:color w:val="215E99" w:themeColor="text2" w:themeTint="BF"/>
+          <w:sz w:val="32"/>
+          <w:szCs w:val="32"/>
+          <w:u w:val="single"/>
+        </w:rPr>
+        <w:fldChar w:fldCharType="separate"/>
+      </w:r>
+      <w:r>
+        <w:rPr>
+          <w:color w:val="215E99" w:themeColor="text2" w:themeTint="BF"/>
+          <w:sz w:val="32"/>
+          <w:szCs w:val="32"/>
+          <w:u w:val="single"/>
+        </w:rPr>
+        <w:t>12</w:t>
+      </w:r>
+      <w:r>
+        <w:rPr>
+          <w:b/>
+          <w:bCs/>
+          <w:color w:val="215E99" w:themeColor="text2" w:themeTint="BF"/>
+          <w:sz w:val="48"/>
+          <w:szCs w:val="48"/>
+          <w:u w:val="single"/>
+        </w:rPr>
+        <w:t>.</w:t>
+      </w:r>
+      <w:r>
+        <w:rPr>
+          <w:color w:val="215E99" w:themeColor="text2" w:themeTint="BF"/>
+          <w:sz w:val="32"/>
+          <w:szCs w:val="32"/>
+          <w:u w:val="single"/>
+        </w:rPr>
+        <w:t xml:space="preserve"> Tablas resumen tarifas Decreto 29/2018, de 17 de abril</w:t>
+      </w:r>
+      <w:r>
+        <w:rPr>
+          <w:color w:val="215E99" w:themeColor="text2" w:themeTint="BF"/>
+          <w:sz w:val="32"/>
+          <w:szCs w:val="32"/>
+          <w:u w:val="single"/>
+        </w:rPr>
+        <w:fldChar w:fldCharType="end"/>
+      </w:r>
+      <w:r>
+        <w:rPr>
+          <w:color w:val="215E99" w:themeColor="text2" w:themeTint="BF"/>
+          <w:sz w:val="32"/>
+          <w:szCs w:val="32"/>
+          <w:u w:val="single"/>
+        </w:rPr>
+        <w:fldChar w:fldCharType="begin"/>
+      </w:r>
+      <w:r>
+        <w:rPr>
+          <w:color w:val="215E99" w:themeColor="text2" w:themeTint="BF"/>
+          <w:sz w:val="32"/>
+          <w:szCs w:val="32"/>
+          <w:u w:val="single"/>
+        </w:rPr>
+        <w:instrText xml:space="preserve"> REF _Ref229052818 \h </w:instrText>
+      </w:r>
+      <w:r>
+        <w:rPr>
+          <w:color w:val="215E99" w:themeColor="text2" w:themeTint="BF"/>
+          <w:sz w:val="32"/>
+          <w:szCs w:val="32"/>
+          <w:u w:val="single"/>
+        </w:rPr>
+      </w:r>
+      <w:r>
+        <w:rPr>
+          <w:color w:val="215E99" w:themeColor="text2" w:themeTint="BF"/>
+          <w:sz w:val="32"/>
+          <w:szCs w:val="32"/>
+          <w:u w:val="single"/>
+        </w:rPr>
+        <w:fldChar w:fldCharType="separate"/>
+      </w:r>
+      <w:r>
+        <w:rPr>
+          <w:color w:val="215E99" w:themeColor="text2" w:themeTint="BF"/>
+          <w:sz w:val="32"/>
+          <w:szCs w:val="32"/>
+          <w:u w:val="single"/>
+        </w:rPr>
+        <w:t>12</w:t>
+      </w:r>
+      <w:r>
+        <w:rPr>
+          <w:b/>
+          <w:bCs/>
+          <w:color w:val="215E99" w:themeColor="text2" w:themeTint="BF"/>
+          <w:sz w:val="48"/>
+          <w:szCs w:val="48"/>
+          <w:u w:val="single"/>
+        </w:rPr>
+        <w:t>.</w:t>
+      </w:r>
+      <w:r>
+        <w:rPr>
+          <w:color w:val="215E99" w:themeColor="text2" w:themeTint="BF"/>
+          <w:sz w:val="32"/>
+          <w:szCs w:val="32"/>
+          <w:u w:val="single"/>
+        </w:rPr>
+        <w:t xml:space="preserve"> Tablas resumen tarifas Decret</w:t>
+      </w:r>
+      <w:r>
+        <w:rPr>
+          <w:color w:val="215E99" w:themeColor="text2" w:themeTint="BF"/>
+          <w:sz w:val="32"/>
+          <w:szCs w:val="32"/>
+          <w:u w:val="single"/>
+        </w:rPr>
+        <w:t>o</w:t>
+      </w:r>
+      <w:r>
+        <w:rPr>
+          <w:color w:val="215E99" w:themeColor="text2" w:themeTint="BF"/>
+          <w:sz w:val="32"/>
+          <w:szCs w:val="32"/>
+          <w:u w:val="single"/>
+        </w:rPr>
+        <w:t xml:space="preserve"> 29/2018, de 17 de abril</w:t>
+      </w:r>
+      <w:r>
+        <w:rPr>
+          <w:color w:val="215E99" w:themeColor="text2" w:themeTint="BF"/>
+          <w:sz w:val="32"/>
+          <w:szCs w:val="32"/>
+          <w:u w:val="single"/>
+        </w:rPr>
+        <w:fldChar w:fldCharType="end"/>
       </w:r>
     </w:p>
     <w:p>
@@ -11162,7 +11280,7 @@
         <w:shd w:val="clear" w:color="auto" w:fill="1F3864"/>
         <w:ind w:left="200" w:right="200"/>
       </w:pPr>
-      <w:bookmarkStart w:id="35" w:name="_Toc229053050"/>
+      <w:bookmarkStart w:id="35" w:name="_Toc229054386"/>
       <w:r>
         <w:lastRenderedPageBreak/>
         <w:t>7. REAL DECRETO 485/1997, de 14 de abril</w:t>
@@ -11552,7 +11670,7 @@
         <w:shd w:val="clear" w:color="auto" w:fill="2E75B6"/>
         <w:ind w:left="200"/>
       </w:pPr>
-      <w:bookmarkStart w:id="36" w:name="_Toc229053051"/>
+      <w:bookmarkStart w:id="36" w:name="_Toc229054387"/>
       <w:r>
         <w:t>Artículos principales</w:t>
       </w:r>
@@ -11654,7 +11772,7 @@
         <w:shd w:val="clear" w:color="auto" w:fill="2E75B6"/>
         <w:ind w:left="200"/>
       </w:pPr>
-      <w:bookmarkStart w:id="37" w:name="_Toc229053052"/>
+      <w:bookmarkStart w:id="37" w:name="_Toc229054388"/>
       <w:r>
         <w:t>Anexos principales</w:t>
       </w:r>
@@ -11667,7 +11785,7 @@
           <w:bottom w:val="single" w:sz="2" w:space="0" w:color="D6E4F0"/>
         </w:pBdr>
       </w:pPr>
-      <w:bookmarkStart w:id="38" w:name="_Toc229053053"/>
+      <w:bookmarkStart w:id="38" w:name="_Toc229054389"/>
       <w:r>
         <w:t>Anexo I — Criterios generales</w:t>
       </w:r>
@@ -11689,7 +11807,7 @@
           <w:bottom w:val="single" w:sz="2" w:space="0" w:color="D6E4F0"/>
         </w:pBdr>
       </w:pPr>
-      <w:bookmarkStart w:id="39" w:name="_Toc229053054"/>
+      <w:bookmarkStart w:id="39" w:name="_Toc229054390"/>
       <w:r>
         <w:t>Anexo II — Colores de seguridad</w:t>
       </w:r>
@@ -11711,7 +11829,7 @@
           <w:bottom w:val="single" w:sz="2" w:space="0" w:color="D6E4F0"/>
         </w:pBdr>
       </w:pPr>
-      <w:bookmarkStart w:id="40" w:name="_Toc229053055"/>
+      <w:bookmarkStart w:id="40" w:name="_Toc229054391"/>
       <w:r>
         <w:t>Anexo III — Señales en forma de panel</w:t>
       </w:r>
@@ -11734,7 +11852,7 @@
           <w:bottom w:val="single" w:sz="2" w:space="0" w:color="D6E4F0"/>
         </w:pBdr>
       </w:pPr>
-      <w:bookmarkStart w:id="41" w:name="_Toc229053056"/>
+      <w:bookmarkStart w:id="41" w:name="_Toc229054392"/>
       <w:r>
         <w:t>Anexo IV — Señales luminosas y acústicas</w:t>
       </w:r>
@@ -11756,7 +11874,7 @@
           <w:bottom w:val="single" w:sz="2" w:space="0" w:color="D6E4F0"/>
         </w:pBdr>
       </w:pPr>
-      <w:bookmarkStart w:id="42" w:name="_Toc229053057"/>
+      <w:bookmarkStart w:id="42" w:name="_Toc229054393"/>
       <w:r>
         <w:t>Anexo V — Comunicaciones verbales</w:t>
       </w:r>
@@ -11778,7 +11896,7 @@
           <w:bottom w:val="single" w:sz="2" w:space="0" w:color="D6E4F0"/>
         </w:pBdr>
       </w:pPr>
-      <w:bookmarkStart w:id="43" w:name="_Toc229053058"/>
+      <w:bookmarkStart w:id="43" w:name="_Toc229054394"/>
       <w:r>
         <w:t>Anexo VI — Señales gestuales</w:t>
       </w:r>
@@ -11800,7 +11918,7 @@
           <w:bottom w:val="single" w:sz="2" w:space="0" w:color="D6E4F0"/>
         </w:pBdr>
       </w:pPr>
-      <w:bookmarkStart w:id="44" w:name="_Toc229053059"/>
+      <w:bookmarkStart w:id="44" w:name="_Toc229054395"/>
       <w:r>
         <w:t>Anexo VII — Señalizaciones específicas</w:t>
       </w:r>
@@ -11846,7 +11964,7 @@
         <w:shd w:val="clear" w:color="auto" w:fill="1F3864"/>
         <w:ind w:left="200" w:right="200"/>
       </w:pPr>
-      <w:bookmarkStart w:id="45" w:name="_Toc229053060"/>
+      <w:bookmarkStart w:id="45" w:name="_Toc229054396"/>
       <w:r>
         <w:lastRenderedPageBreak/>
         <w:t>8. REAL DECRETO 486/1997, de 14 de abril</w:t>
@@ -12236,7 +12354,7 @@
         <w:shd w:val="clear" w:color="auto" w:fill="2E75B6"/>
         <w:ind w:left="200"/>
       </w:pPr>
-      <w:bookmarkStart w:id="46" w:name="_Toc229053061"/>
+      <w:bookmarkStart w:id="46" w:name="_Toc229054397"/>
       <w:r>
         <w:t>Artículos principales</w:t>
       </w:r>
@@ -12287,7 +12405,7 @@
         <w:shd w:val="clear" w:color="auto" w:fill="2E75B6"/>
         <w:ind w:left="200"/>
       </w:pPr>
-      <w:bookmarkStart w:id="47" w:name="_Toc229053062"/>
+      <w:bookmarkStart w:id="47" w:name="_Toc229054398"/>
       <w:r>
         <w:t>Anexo I — Condiciones generales de seguridad</w:t>
       </w:r>
@@ -12309,7 +12427,7 @@
           <w:bottom w:val="single" w:sz="2" w:space="0" w:color="D6E4F0"/>
         </w:pBdr>
       </w:pPr>
-      <w:bookmarkStart w:id="48" w:name="_Toc229053063"/>
+      <w:bookmarkStart w:id="48" w:name="_Toc229054399"/>
       <w:r>
         <w:t>1. Seguridad estructural</w:t>
       </w:r>
@@ -12331,7 +12449,7 @@
           <w:bottom w:val="single" w:sz="2" w:space="0" w:color="D6E4F0"/>
         </w:pBdr>
       </w:pPr>
-      <w:bookmarkStart w:id="49" w:name="_Toc229053064"/>
+      <w:bookmarkStart w:id="49" w:name="_Toc229054400"/>
       <w:r>
         <w:t>2. Espacios de trabajo y zonas peligrosas</w:t>
       </w:r>
@@ -12353,7 +12471,7 @@
           <w:bottom w:val="single" w:sz="2" w:space="0" w:color="D6E4F0"/>
         </w:pBdr>
       </w:pPr>
-      <w:bookmarkStart w:id="50" w:name="_Toc229053065"/>
+      <w:bookmarkStart w:id="50" w:name="_Toc229054401"/>
       <w:r>
         <w:t>3. Suelos, aberturas y barandillas</w:t>
       </w:r>
@@ -12375,7 +12493,7 @@
           <w:bottom w:val="single" w:sz="2" w:space="0" w:color="D6E4F0"/>
         </w:pBdr>
       </w:pPr>
-      <w:bookmarkStart w:id="51" w:name="_Toc229053066"/>
+      <w:bookmarkStart w:id="51" w:name="_Toc229054402"/>
       <w:r>
         <w:t>4. Tabiques, ventanas y vanos</w:t>
       </w:r>
@@ -12397,7 +12515,7 @@
           <w:bottom w:val="single" w:sz="2" w:space="0" w:color="D6E4F0"/>
         </w:pBdr>
       </w:pPr>
-      <w:bookmarkStart w:id="52" w:name="_Toc229053067"/>
+      <w:bookmarkStart w:id="52" w:name="_Toc229054403"/>
       <w:r>
         <w:lastRenderedPageBreak/>
         <w:t>5. Vías de circulación</w:t>
@@ -12420,7 +12538,7 @@
           <w:bottom w:val="single" w:sz="2" w:space="0" w:color="D6E4F0"/>
         </w:pBdr>
       </w:pPr>
-      <w:bookmarkStart w:id="53" w:name="_Toc229053068"/>
+      <w:bookmarkStart w:id="53" w:name="_Toc229054404"/>
       <w:r>
         <w:t>6. Puertas y portones</w:t>
       </w:r>
@@ -12450,7 +12568,7 @@
           <w:bottom w:val="single" w:sz="2" w:space="0" w:color="D6E4F0"/>
         </w:pBdr>
       </w:pPr>
-      <w:bookmarkStart w:id="54" w:name="_Toc229053069"/>
+      <w:bookmarkStart w:id="54" w:name="_Toc229054405"/>
       <w:r>
         <w:t>7. Rampas, escaleras fijas y de servicio</w:t>
       </w:r>
@@ -12477,7 +12595,7 @@
           <w:bottom w:val="single" w:sz="2" w:space="0" w:color="D6E4F0"/>
         </w:pBdr>
       </w:pPr>
-      <w:bookmarkStart w:id="55" w:name="_Toc229053070"/>
+      <w:bookmarkStart w:id="55" w:name="_Toc229054406"/>
       <w:r>
         <w:t>8. Escalas fijas</w:t>
       </w:r>
@@ -12499,7 +12617,7 @@
           <w:bottom w:val="single" w:sz="2" w:space="0" w:color="D6E4F0"/>
         </w:pBdr>
       </w:pPr>
-      <w:bookmarkStart w:id="56" w:name="_Toc229053071"/>
+      <w:bookmarkStart w:id="56" w:name="_Toc229054407"/>
       <w:r>
         <w:t>10. Vías y salidas de evacuación</w:t>
       </w:r>
@@ -12521,7 +12639,7 @@
           <w:bottom w:val="single" w:sz="2" w:space="0" w:color="D6E4F0"/>
         </w:pBdr>
       </w:pPr>
-      <w:bookmarkStart w:id="57" w:name="_Toc229053072"/>
+      <w:bookmarkStart w:id="57" w:name="_Toc229054408"/>
       <w:r>
         <w:t>11. Condiciones de protección contra incendios</w:t>
       </w:r>
@@ -12543,7 +12661,7 @@
           <w:bottom w:val="single" w:sz="2" w:space="0" w:color="D6E4F0"/>
         </w:pBdr>
       </w:pPr>
-      <w:bookmarkStart w:id="58" w:name="_Toc229053073"/>
+      <w:bookmarkStart w:id="58" w:name="_Toc229054409"/>
       <w:r>
         <w:t>12. Instalación eléctrica</w:t>
       </w:r>
@@ -12564,7 +12682,7 @@
         <w:shd w:val="clear" w:color="auto" w:fill="2E75B6"/>
         <w:ind w:left="200"/>
       </w:pPr>
-      <w:bookmarkStart w:id="59" w:name="_Toc229053074"/>
+      <w:bookmarkStart w:id="59" w:name="_Toc229054410"/>
       <w:r>
         <w:t>Anexo III — Condiciones ambientales</w:t>
       </w:r>
@@ -12585,7 +12703,7 @@
         <w:shd w:val="clear" w:color="auto" w:fill="2E75B6"/>
         <w:ind w:left="200"/>
       </w:pPr>
-      <w:bookmarkStart w:id="60" w:name="_Toc229053075"/>
+      <w:bookmarkStart w:id="60" w:name="_Toc229054411"/>
       <w:r>
         <w:t>Anexo IV — Iluminación</w:t>
       </w:r>
@@ -12606,7 +12724,7 @@
         <w:shd w:val="clear" w:color="auto" w:fill="2E75B6"/>
         <w:ind w:left="200"/>
       </w:pPr>
-      <w:bookmarkStart w:id="61" w:name="_Toc229053076"/>
+      <w:bookmarkStart w:id="61" w:name="_Toc229054412"/>
       <w:r>
         <w:lastRenderedPageBreak/>
         <w:t>Anexo V — Servicios higiénicos y locales de descanso</w:t>
@@ -12637,7 +12755,7 @@
         <w:shd w:val="clear" w:color="auto" w:fill="2E75B6"/>
         <w:ind w:left="200"/>
       </w:pPr>
-      <w:bookmarkStart w:id="62" w:name="_Toc229053077"/>
+      <w:bookmarkStart w:id="62" w:name="_Toc229054413"/>
       <w:r>
         <w:t>Anexo VI — Material y locales de primeros auxilios</w:t>
       </w:r>
@@ -12683,7 +12801,7 @@
         <w:shd w:val="clear" w:color="auto" w:fill="1F3864"/>
         <w:ind w:left="200" w:right="200"/>
       </w:pPr>
-      <w:bookmarkStart w:id="63" w:name="_Toc229053078"/>
+      <w:bookmarkStart w:id="63" w:name="_Toc229054414"/>
       <w:r>
         <w:lastRenderedPageBreak/>
         <w:t>9. REAL DECRETO 488/1997, de 14 de abril</w:t>
@@ -13073,7 +13191,7 @@
         <w:shd w:val="clear" w:color="auto" w:fill="2E75B6"/>
         <w:ind w:left="200"/>
       </w:pPr>
-      <w:bookmarkStart w:id="64" w:name="_Toc229053079"/>
+      <w:bookmarkStart w:id="64" w:name="_Toc229054415"/>
       <w:r>
         <w:t>Artículos principales</w:t>
       </w:r>
@@ -13175,7 +13293,7 @@
         <w:shd w:val="clear" w:color="auto" w:fill="2E75B6"/>
         <w:ind w:left="200"/>
       </w:pPr>
-      <w:bookmarkStart w:id="65" w:name="_Toc229053080"/>
+      <w:bookmarkStart w:id="65" w:name="_Toc229054416"/>
       <w:r>
         <w:t>Anexo — Disposiciones mínimas</w:t>
       </w:r>
@@ -13188,7 +13306,7 @@
           <w:bottom w:val="single" w:sz="2" w:space="0" w:color="D6E4F0"/>
         </w:pBdr>
       </w:pPr>
-      <w:bookmarkStart w:id="66" w:name="_Toc229053081"/>
+      <w:bookmarkStart w:id="66" w:name="_Toc229054417"/>
       <w:r>
         <w:t>1. Equipo</w:t>
       </w:r>
@@ -13238,7 +13356,7 @@
           <w:bottom w:val="single" w:sz="2" w:space="0" w:color="D6E4F0"/>
         </w:pBdr>
       </w:pPr>
-      <w:bookmarkStart w:id="67" w:name="_Toc229053082"/>
+      <w:bookmarkStart w:id="67" w:name="_Toc229054418"/>
       <w:r>
         <w:t>2. Entorno</w:t>
       </w:r>
@@ -13260,7 +13378,7 @@
           <w:bottom w:val="single" w:sz="2" w:space="0" w:color="D6E4F0"/>
         </w:pBdr>
       </w:pPr>
-      <w:bookmarkStart w:id="68" w:name="_Toc229053083"/>
+      <w:bookmarkStart w:id="68" w:name="_Toc229054419"/>
       <w:r>
         <w:t>3. Interconexión ordenador/persona</w:t>
       </w:r>
@@ -13289,16 +13407,10 @@
         <w:shd w:val="clear" w:color="auto" w:fill="1F3864"/>
         <w:ind w:left="200" w:right="200"/>
       </w:pPr>
-      <w:bookmarkStart w:id="69" w:name="_Toc229053084"/>
+      <w:bookmarkStart w:id="69" w:name="_Toc229054420"/>
       <w:r>
         <w:lastRenderedPageBreak/>
-        <w:t>10</w:t>
-      </w:r>
-      <w:r>
-        <w:t>.</w:t>
-      </w:r>
-      <w:r>
-        <w:t>Tipos de presas de Madrid</w:t>
+        <w:t>10.Tipos de presas de Madrid</w:t>
       </w:r>
       <w:bookmarkEnd w:id="69"/>
     </w:p>
@@ -13330,7 +13442,7 @@
                     <pic:cNvPicPr/>
                   </pic:nvPicPr>
                   <pic:blipFill>
-                    <a:blip r:embed="rId8">
+                    <a:blip r:embed="rId9">
                       <a:extLst>
                         <a:ext uri="{28A0092B-C50C-407E-A947-70E740481C1C}">
                           <a14:useLocalDpi xmlns:a14="http://schemas.microsoft.com/office/drawing/2010/main" val="0"/>
@@ -13385,7 +13497,7 @@
                     <pic:cNvPicPr/>
                   </pic:nvPicPr>
                   <pic:blipFill>
-                    <a:blip r:embed="rId9">
+                    <a:blip r:embed="rId10">
                       <a:extLst>
                         <a:ext uri="{28A0092B-C50C-407E-A947-70E740481C1C}">
                           <a14:useLocalDpi xmlns:a14="http://schemas.microsoft.com/office/drawing/2010/main" val="0"/>
@@ -13426,7 +13538,7 @@
         <w:shd w:val="clear" w:color="auto" w:fill="1F3864"/>
         <w:ind w:left="200" w:right="200"/>
       </w:pPr>
-      <w:bookmarkStart w:id="70" w:name="_Toc229053085"/>
+      <w:bookmarkStart w:id="70" w:name="_Toc229054421"/>
       <w:r>
         <w:lastRenderedPageBreak/>
         <w:t>1</w:t>
@@ -13435,10 +13547,7 @@
         <w:t>1</w:t>
       </w:r>
       <w:r>
-        <w:t>.</w:t>
-      </w:r>
-      <w:r>
-        <w:t>Convenio Canal</w:t>
+        <w:t>.Convenio Canal</w:t>
       </w:r>
       <w:bookmarkEnd w:id="70"/>
     </w:p>
@@ -13470,7 +13579,7 @@
                     <pic:cNvPicPr/>
                   </pic:nvPicPr>
                   <pic:blipFill rotWithShape="1">
-                    <a:blip r:embed="rId10">
+                    <a:blip r:embed="rId11">
                       <a:extLst>
                         <a:ext uri="{28A0092B-C50C-407E-A947-70E740481C1C}">
                           <a14:useLocalDpi xmlns:a14="http://schemas.microsoft.com/office/drawing/2010/main" val="0"/>
@@ -13513,8 +13622,6 @@
         <w:tblInd w:w="8" w:type="dxa"/>
         <w:tblCellMar>
           <w:top w:w="54" w:type="dxa"/>
-          <w:left w:w="0" w:type="dxa"/>
-          <w:bottom w:w="0" w:type="dxa"/>
           <w:right w:w="21" w:type="dxa"/>
         </w:tblCellMar>
         <w:tblLook w:val="04A0" w:firstRow="1" w:lastRow="0" w:firstColumn="1" w:lastColumn="0" w:noHBand="0" w:noVBand="1"/>
@@ -14941,7 +15048,6 @@
         <w:tblCellMar>
           <w:top w:w="62" w:type="dxa"/>
           <w:left w:w="36" w:type="dxa"/>
-          <w:bottom w:w="0" w:type="dxa"/>
           <w:right w:w="28" w:type="dxa"/>
         </w:tblCellMar>
         <w:tblLook w:val="04A0" w:firstRow="1" w:lastRow="0" w:firstColumn="1" w:lastColumn="0" w:noHBand="0" w:noVBand="1"/>
@@ -15463,7 +15569,6 @@
         <w:tblCellMar>
           <w:top w:w="56" w:type="dxa"/>
           <w:left w:w="36" w:type="dxa"/>
-          <w:bottom w:w="0" w:type="dxa"/>
           <w:right w:w="105" w:type="dxa"/>
         </w:tblCellMar>
         <w:tblLook w:val="04A0" w:firstRow="1" w:lastRow="0" w:firstColumn="1" w:lastColumn="0" w:noHBand="0" w:noVBand="1"/>
@@ -18311,7 +18416,7 @@
           <w:rFonts w:ascii="Calibri" w:eastAsia="Calibri" w:hAnsi="Calibri" w:cs="Calibri"/>
         </w:rPr>
         <w:sectPr>
-          <w:footerReference w:type="default" r:id="rId11"/>
+          <w:footerReference w:type="default" r:id="rId12"/>
           <w:pgSz w:w="11906" w:h="16838"/>
           <w:pgMar w:top="1440" w:right="1260" w:bottom="1440" w:left="1260" w:header="708" w:footer="708" w:gutter="0"/>
           <w:cols w:space="720"/>
@@ -18330,25 +18435,22 @@
       </w:pPr>
       <w:bookmarkStart w:id="71" w:name="_Ref229052810"/>
       <w:bookmarkStart w:id="72" w:name="_Ref229052818"/>
-      <w:bookmarkStart w:id="73" w:name="_Toc229053086"/>
+      <w:bookmarkStart w:id="73" w:name="_Toc229054422"/>
       <w:r>
         <w:lastRenderedPageBreak/>
-        <w:t>1</w:t>
-      </w:r>
-      <w:r>
-        <w:t>2</w:t>
-      </w:r>
-      <w:r>
-        <w:t>.</w:t>
-      </w:r>
-      <w:r>
-        <w:t xml:space="preserve"> Tablas resumen tarifas D</w:t>
+        <w:t>12. Tablas resumen tarifas D</w:t>
       </w:r>
       <w:r>
         <w:t>ecreto 29/2018, de 17 de abril</w:t>
       </w:r>
       <w:bookmarkEnd w:id="71"/>
       <w:bookmarkEnd w:id="72"/>
+      <w:r>
+        <w:t xml:space="preserve"> </w:t>
+      </w:r>
+      <w:r>
+        <w:t>y de la Orden 1330/2018</w:t>
+      </w:r>
       <w:bookmarkEnd w:id="73"/>
     </w:p>
     <w:p>
@@ -18421,12 +18523,6 @@
         <w:gridCol w:w="3720"/>
       </w:tblGrid>
       <w:tr>
-        <w:tblPrEx>
-          <w:tblCellMar>
-            <w:top w:w="0" w:type="dxa"/>
-            <w:bottom w:w="0" w:type="dxa"/>
-          </w:tblCellMar>
-        </w:tblPrEx>
         <w:tc>
           <w:tcPr>
             <w:tcW w:w="13680" w:type="dxa"/>
@@ -18462,12 +18558,6 @@
         </w:tc>
       </w:tr>
       <w:tr>
-        <w:tblPrEx>
-          <w:tblCellMar>
-            <w:top w:w="0" w:type="dxa"/>
-            <w:bottom w:w="0" w:type="dxa"/>
-          </w:tblCellMar>
-        </w:tblPrEx>
         <w:tc>
           <w:tcPr>
             <w:tcW w:w="2200" w:type="dxa"/>
@@ -18606,12 +18696,6 @@
         </w:tc>
       </w:tr>
       <w:tr>
-        <w:tblPrEx>
-          <w:tblCellMar>
-            <w:top w:w="0" w:type="dxa"/>
-            <w:bottom w:w="0" w:type="dxa"/>
-          </w:tblCellMar>
-        </w:tblPrEx>
         <w:tc>
           <w:tcPr>
             <w:tcW w:w="2200" w:type="dxa"/>
@@ -18770,12 +18854,6 @@
         </w:tc>
       </w:tr>
       <w:tr>
-        <w:tblPrEx>
-          <w:tblCellMar>
-            <w:top w:w="0" w:type="dxa"/>
-            <w:bottom w:w="0" w:type="dxa"/>
-          </w:tblCellMar>
-        </w:tblPrEx>
         <w:tc>
           <w:tcPr>
             <w:tcW w:w="2200" w:type="dxa"/>
@@ -18898,12 +18976,6 @@
         </w:tc>
       </w:tr>
       <w:tr>
-        <w:tblPrEx>
-          <w:tblCellMar>
-            <w:top w:w="0" w:type="dxa"/>
-            <w:bottom w:w="0" w:type="dxa"/>
-          </w:tblCellMar>
-        </w:tblPrEx>
         <w:tc>
           <w:tcPr>
             <w:tcW w:w="2200" w:type="dxa"/>
@@ -19044,12 +19116,6 @@
         </w:tc>
       </w:tr>
       <w:tr>
-        <w:tblPrEx>
-          <w:tblCellMar>
-            <w:top w:w="0" w:type="dxa"/>
-            <w:bottom w:w="0" w:type="dxa"/>
-          </w:tblCellMar>
-        </w:tblPrEx>
         <w:tc>
           <w:tcPr>
             <w:tcW w:w="2200" w:type="dxa"/>
@@ -19190,12 +19256,6 @@
         </w:tc>
       </w:tr>
       <w:tr>
-        <w:tblPrEx>
-          <w:tblCellMar>
-            <w:top w:w="0" w:type="dxa"/>
-            <w:bottom w:w="0" w:type="dxa"/>
-          </w:tblCellMar>
-        </w:tblPrEx>
         <w:tc>
           <w:tcPr>
             <w:tcW w:w="2200" w:type="dxa"/>
@@ -19354,12 +19414,6 @@
         </w:tc>
       </w:tr>
       <w:tr>
-        <w:tblPrEx>
-          <w:tblCellMar>
-            <w:top w:w="0" w:type="dxa"/>
-            <w:bottom w:w="0" w:type="dxa"/>
-          </w:tblCellMar>
-        </w:tblPrEx>
         <w:tc>
           <w:tcPr>
             <w:tcW w:w="2200" w:type="dxa"/>
@@ -19482,12 +19536,6 @@
         </w:tc>
       </w:tr>
       <w:tr>
-        <w:tblPrEx>
-          <w:tblCellMar>
-            <w:top w:w="0" w:type="dxa"/>
-            <w:bottom w:w="0" w:type="dxa"/>
-          </w:tblCellMar>
-        </w:tblPrEx>
         <w:tc>
           <w:tcPr>
             <w:tcW w:w="2200" w:type="dxa"/>
@@ -19705,12 +19753,6 @@
         <w:gridCol w:w="1520"/>
       </w:tblGrid>
       <w:tr>
-        <w:tblPrEx>
-          <w:tblCellMar>
-            <w:top w:w="0" w:type="dxa"/>
-            <w:bottom w:w="0" w:type="dxa"/>
-          </w:tblCellMar>
-        </w:tblPrEx>
         <w:tc>
           <w:tcPr>
             <w:tcW w:w="13680" w:type="dxa"/>
@@ -19748,12 +19790,6 @@
         </w:tc>
       </w:tr>
       <w:tr>
-        <w:tblPrEx>
-          <w:tblCellMar>
-            <w:top w:w="0" w:type="dxa"/>
-            <w:bottom w:w="0" w:type="dxa"/>
-          </w:tblCellMar>
-        </w:tblPrEx>
         <w:tc>
           <w:tcPr>
             <w:tcW w:w="2800" w:type="dxa"/>
@@ -20028,12 +20064,6 @@
         </w:tc>
       </w:tr>
       <w:tr>
-        <w:tblPrEx>
-          <w:tblCellMar>
-            <w:top w:w="0" w:type="dxa"/>
-            <w:bottom w:w="0" w:type="dxa"/>
-          </w:tblCellMar>
-        </w:tblPrEx>
         <w:tc>
           <w:tcPr>
             <w:tcW w:w="2800" w:type="dxa"/>
@@ -20309,12 +20339,6 @@
         </w:tc>
       </w:tr>
       <w:tr>
-        <w:tblPrEx>
-          <w:tblCellMar>
-            <w:top w:w="0" w:type="dxa"/>
-            <w:bottom w:w="0" w:type="dxa"/>
-          </w:tblCellMar>
-        </w:tblPrEx>
         <w:tc>
           <w:tcPr>
             <w:tcW w:w="2800" w:type="dxa"/>
@@ -20537,12 +20561,6 @@
         </w:tc>
       </w:tr>
       <w:tr>
-        <w:tblPrEx>
-          <w:tblCellMar>
-            <w:top w:w="0" w:type="dxa"/>
-            <w:bottom w:w="0" w:type="dxa"/>
-          </w:tblCellMar>
-        </w:tblPrEx>
         <w:tc>
           <w:tcPr>
             <w:tcW w:w="2800" w:type="dxa"/>
@@ -20765,12 +20783,6 @@
         </w:tc>
       </w:tr>
       <w:tr>
-        <w:tblPrEx>
-          <w:tblCellMar>
-            <w:top w:w="0" w:type="dxa"/>
-            <w:bottom w:w="0" w:type="dxa"/>
-          </w:tblCellMar>
-        </w:tblPrEx>
         <w:tc>
           <w:tcPr>
             <w:tcW w:w="13680" w:type="dxa"/>
@@ -20808,12 +20820,6 @@
         </w:tc>
       </w:tr>
       <w:tr>
-        <w:tblPrEx>
-          <w:tblCellMar>
-            <w:top w:w="0" w:type="dxa"/>
-            <w:bottom w:w="0" w:type="dxa"/>
-          </w:tblCellMar>
-        </w:tblPrEx>
         <w:tc>
           <w:tcPr>
             <w:tcW w:w="2800" w:type="dxa"/>
@@ -21089,12 +21095,6 @@
         </w:tc>
       </w:tr>
       <w:tr>
-        <w:tblPrEx>
-          <w:tblCellMar>
-            <w:top w:w="0" w:type="dxa"/>
-            <w:bottom w:w="0" w:type="dxa"/>
-          </w:tblCellMar>
-        </w:tblPrEx>
         <w:tc>
           <w:tcPr>
             <w:tcW w:w="2800" w:type="dxa"/>
@@ -21317,12 +21317,6 @@
         </w:tc>
       </w:tr>
       <w:tr>
-        <w:tblPrEx>
-          <w:tblCellMar>
-            <w:top w:w="0" w:type="dxa"/>
-            <w:bottom w:w="0" w:type="dxa"/>
-          </w:tblCellMar>
-        </w:tblPrEx>
         <w:tc>
           <w:tcPr>
             <w:tcW w:w="2800" w:type="dxa"/>
@@ -21545,12 +21539,6 @@
         </w:tc>
       </w:tr>
       <w:tr>
-        <w:tblPrEx>
-          <w:tblCellMar>
-            <w:top w:w="0" w:type="dxa"/>
-            <w:bottom w:w="0" w:type="dxa"/>
-          </w:tblCellMar>
-        </w:tblPrEx>
         <w:tc>
           <w:tcPr>
             <w:tcW w:w="13680" w:type="dxa"/>
@@ -21588,12 +21576,6 @@
         </w:tc>
       </w:tr>
       <w:tr>
-        <w:tblPrEx>
-          <w:tblCellMar>
-            <w:top w:w="0" w:type="dxa"/>
-            <w:bottom w:w="0" w:type="dxa"/>
-          </w:tblCellMar>
-        </w:tblPrEx>
         <w:tc>
           <w:tcPr>
             <w:tcW w:w="2800" w:type="dxa"/>
@@ -21869,12 +21851,6 @@
         </w:tc>
       </w:tr>
       <w:tr>
-        <w:tblPrEx>
-          <w:tblCellMar>
-            <w:top w:w="0" w:type="dxa"/>
-            <w:bottom w:w="0" w:type="dxa"/>
-          </w:tblCellMar>
-        </w:tblPrEx>
         <w:tc>
           <w:tcPr>
             <w:tcW w:w="2800" w:type="dxa"/>
@@ -22097,12 +22073,6 @@
         </w:tc>
       </w:tr>
       <w:tr>
-        <w:tblPrEx>
-          <w:tblCellMar>
-            <w:top w:w="0" w:type="dxa"/>
-            <w:bottom w:w="0" w:type="dxa"/>
-          </w:tblCellMar>
-        </w:tblPrEx>
         <w:tc>
           <w:tcPr>
             <w:tcW w:w="2800" w:type="dxa"/>
@@ -22325,12 +22295,6 @@
         </w:tc>
       </w:tr>
       <w:tr>
-        <w:tblPrEx>
-          <w:tblCellMar>
-            <w:top w:w="0" w:type="dxa"/>
-            <w:bottom w:w="0" w:type="dxa"/>
-          </w:tblCellMar>
-        </w:tblPrEx>
         <w:tc>
           <w:tcPr>
             <w:tcW w:w="13680" w:type="dxa"/>
@@ -22368,12 +22332,6 @@
         </w:tc>
       </w:tr>
       <w:tr>
-        <w:tblPrEx>
-          <w:tblCellMar>
-            <w:top w:w="0" w:type="dxa"/>
-            <w:bottom w:w="0" w:type="dxa"/>
-          </w:tblCellMar>
-        </w:tblPrEx>
         <w:tc>
           <w:tcPr>
             <w:tcW w:w="2800" w:type="dxa"/>
@@ -22649,12 +22607,6 @@
         </w:tc>
       </w:tr>
       <w:tr>
-        <w:tblPrEx>
-          <w:tblCellMar>
-            <w:top w:w="0" w:type="dxa"/>
-            <w:bottom w:w="0" w:type="dxa"/>
-          </w:tblCellMar>
-        </w:tblPrEx>
         <w:tc>
           <w:tcPr>
             <w:tcW w:w="2800" w:type="dxa"/>
@@ -22877,12 +22829,6 @@
         </w:tc>
       </w:tr>
       <w:tr>
-        <w:tblPrEx>
-          <w:tblCellMar>
-            <w:top w:w="0" w:type="dxa"/>
-            <w:bottom w:w="0" w:type="dxa"/>
-          </w:tblCellMar>
-        </w:tblPrEx>
         <w:tc>
           <w:tcPr>
             <w:tcW w:w="2800" w:type="dxa"/>
@@ -23213,12 +23159,6 @@
         <w:gridCol w:w="1368"/>
       </w:tblGrid>
       <w:tr>
-        <w:tblPrEx>
-          <w:tblCellMar>
-            <w:top w:w="0" w:type="dxa"/>
-            <w:bottom w:w="0" w:type="dxa"/>
-          </w:tblCellMar>
-        </w:tblPrEx>
         <w:tc>
           <w:tcPr>
             <w:tcW w:w="13680" w:type="dxa"/>
@@ -23256,12 +23196,6 @@
         </w:tc>
       </w:tr>
       <w:tr>
-        <w:tblPrEx>
-          <w:tblCellMar>
-            <w:top w:w="0" w:type="dxa"/>
-            <w:bottom w:w="0" w:type="dxa"/>
-          </w:tblCellMar>
-        </w:tblPrEx>
         <w:tc>
           <w:tcPr>
             <w:tcW w:w="1600" w:type="dxa"/>
@@ -23638,12 +23572,6 @@
         </w:tc>
       </w:tr>
       <w:tr>
-        <w:tblPrEx>
-          <w:tblCellMar>
-            <w:top w:w="0" w:type="dxa"/>
-            <w:bottom w:w="0" w:type="dxa"/>
-          </w:tblCellMar>
-        </w:tblPrEx>
         <w:tc>
           <w:tcPr>
             <w:tcW w:w="1600" w:type="dxa"/>
@@ -24019,12 +23947,6 @@
         </w:tc>
       </w:tr>
       <w:tr>
-        <w:tblPrEx>
-          <w:tblCellMar>
-            <w:top w:w="0" w:type="dxa"/>
-            <w:bottom w:w="0" w:type="dxa"/>
-          </w:tblCellMar>
-        </w:tblPrEx>
         <w:tc>
           <w:tcPr>
             <w:tcW w:w="1600" w:type="dxa"/>
@@ -24488,12 +24410,6 @@
         <w:gridCol w:w="1369"/>
       </w:tblGrid>
       <w:tr>
-        <w:tblPrEx>
-          <w:tblCellMar>
-            <w:top w:w="0" w:type="dxa"/>
-            <w:bottom w:w="0" w:type="dxa"/>
-          </w:tblCellMar>
-        </w:tblPrEx>
         <w:tc>
           <w:tcPr>
             <w:tcW w:w="13680" w:type="dxa"/>
@@ -24531,12 +24447,6 @@
         </w:tc>
       </w:tr>
       <w:tr>
-        <w:tblPrEx>
-          <w:tblCellMar>
-            <w:top w:w="0" w:type="dxa"/>
-            <w:bottom w:w="0" w:type="dxa"/>
-          </w:tblCellMar>
-        </w:tblPrEx>
         <w:tc>
           <w:tcPr>
             <w:tcW w:w="1600" w:type="dxa"/>
@@ -24913,12 +24823,6 @@
         </w:tc>
       </w:tr>
       <w:tr>
-        <w:tblPrEx>
-          <w:tblCellMar>
-            <w:top w:w="0" w:type="dxa"/>
-            <w:bottom w:w="0" w:type="dxa"/>
-          </w:tblCellMar>
-        </w:tblPrEx>
         <w:tc>
           <w:tcPr>
             <w:tcW w:w="1600" w:type="dxa"/>
@@ -25294,12 +25198,6 @@
         </w:tc>
       </w:tr>
       <w:tr>
-        <w:tblPrEx>
-          <w:tblCellMar>
-            <w:top w:w="0" w:type="dxa"/>
-            <w:bottom w:w="0" w:type="dxa"/>
-          </w:tblCellMar>
-        </w:tblPrEx>
         <w:tc>
           <w:tcPr>
             <w:tcW w:w="1600" w:type="dxa"/>
@@ -25763,12 +25661,6 @@
         <w:gridCol w:w="4120"/>
       </w:tblGrid>
       <w:tr>
-        <w:tblPrEx>
-          <w:tblCellMar>
-            <w:top w:w="0" w:type="dxa"/>
-            <w:bottom w:w="0" w:type="dxa"/>
-          </w:tblCellMar>
-        </w:tblPrEx>
         <w:tc>
           <w:tcPr>
             <w:tcW w:w="13680" w:type="dxa"/>
@@ -25804,12 +25696,6 @@
         </w:tc>
       </w:tr>
       <w:tr>
-        <w:tblPrEx>
-          <w:tblCellMar>
-            <w:top w:w="0" w:type="dxa"/>
-            <w:bottom w:w="0" w:type="dxa"/>
-          </w:tblCellMar>
-        </w:tblPrEx>
         <w:tc>
           <w:tcPr>
             <w:tcW w:w="3200" w:type="dxa"/>
@@ -25982,12 +25868,6 @@
         </w:tc>
       </w:tr>
       <w:tr>
-        <w:tblPrEx>
-          <w:tblCellMar>
-            <w:top w:w="0" w:type="dxa"/>
-            <w:bottom w:w="0" w:type="dxa"/>
-          </w:tblCellMar>
-        </w:tblPrEx>
         <w:tc>
           <w:tcPr>
             <w:tcW w:w="3200" w:type="dxa"/>
@@ -26188,12 +26068,6 @@
         </w:tc>
       </w:tr>
       <w:tr>
-        <w:tblPrEx>
-          <w:tblCellMar>
-            <w:top w:w="0" w:type="dxa"/>
-            <w:bottom w:w="0" w:type="dxa"/>
-          </w:tblCellMar>
-        </w:tblPrEx>
         <w:tc>
           <w:tcPr>
             <w:tcW w:w="3200" w:type="dxa"/>
@@ -26384,12 +26258,6 @@
         </w:tc>
       </w:tr>
       <w:tr>
-        <w:tblPrEx>
-          <w:tblCellMar>
-            <w:top w:w="0" w:type="dxa"/>
-            <w:bottom w:w="0" w:type="dxa"/>
-          </w:tblCellMar>
-        </w:tblPrEx>
         <w:tc>
           <w:tcPr>
             <w:tcW w:w="3200" w:type="dxa"/>
@@ -26580,12 +26448,6 @@
         </w:tc>
       </w:tr>
       <w:tr>
-        <w:tblPrEx>
-          <w:tblCellMar>
-            <w:top w:w="0" w:type="dxa"/>
-            <w:bottom w:w="0" w:type="dxa"/>
-          </w:tblCellMar>
-        </w:tblPrEx>
         <w:tc>
           <w:tcPr>
             <w:tcW w:w="3200" w:type="dxa"/>
@@ -26785,12 +26647,6 @@
         </w:tc>
       </w:tr>
       <w:tr>
-        <w:tblPrEx>
-          <w:tblCellMar>
-            <w:top w:w="0" w:type="dxa"/>
-            <w:bottom w:w="0" w:type="dxa"/>
-          </w:tblCellMar>
-        </w:tblPrEx>
         <w:tc>
           <w:tcPr>
             <w:tcW w:w="3200" w:type="dxa"/>
@@ -26990,12 +26846,6 @@
         </w:tc>
       </w:tr>
       <w:tr>
-        <w:tblPrEx>
-          <w:tblCellMar>
-            <w:top w:w="0" w:type="dxa"/>
-            <w:bottom w:w="0" w:type="dxa"/>
-          </w:tblCellMar>
-        </w:tblPrEx>
         <w:tc>
           <w:tcPr>
             <w:tcW w:w="3200" w:type="dxa"/>
@@ -27195,12 +27045,6 @@
         </w:tc>
       </w:tr>
       <w:tr>
-        <w:tblPrEx>
-          <w:tblCellMar>
-            <w:top w:w="0" w:type="dxa"/>
-            <w:bottom w:w="0" w:type="dxa"/>
-          </w:tblCellMar>
-        </w:tblPrEx>
         <w:tc>
           <w:tcPr>
             <w:tcW w:w="3200" w:type="dxa"/>
@@ -27364,12 +27208,6 @@
         </w:tc>
       </w:tr>
       <w:tr>
-        <w:tblPrEx>
-          <w:tblCellMar>
-            <w:top w:w="0" w:type="dxa"/>
-            <w:bottom w:w="0" w:type="dxa"/>
-          </w:tblCellMar>
-        </w:tblPrEx>
         <w:tc>
           <w:tcPr>
             <w:tcW w:w="3200" w:type="dxa"/>
@@ -27533,12 +27371,6 @@
         </w:tc>
       </w:tr>
       <w:tr>
-        <w:tblPrEx>
-          <w:tblCellMar>
-            <w:top w:w="0" w:type="dxa"/>
-            <w:bottom w:w="0" w:type="dxa"/>
-          </w:tblCellMar>
-        </w:tblPrEx>
         <w:tc>
           <w:tcPr>
             <w:tcW w:w="3200" w:type="dxa"/>
@@ -27809,12 +27641,6 @@
         <w:gridCol w:w="4120"/>
       </w:tblGrid>
       <w:tr>
-        <w:tblPrEx>
-          <w:tblCellMar>
-            <w:top w:w="0" w:type="dxa"/>
-            <w:bottom w:w="0" w:type="dxa"/>
-          </w:tblCellMar>
-        </w:tblPrEx>
         <w:tc>
           <w:tcPr>
             <w:tcW w:w="13680" w:type="dxa"/>
@@ -27850,12 +27676,6 @@
         </w:tc>
       </w:tr>
       <w:tr>
-        <w:tblPrEx>
-          <w:tblCellMar>
-            <w:top w:w="0" w:type="dxa"/>
-            <w:bottom w:w="0" w:type="dxa"/>
-          </w:tblCellMar>
-        </w:tblPrEx>
         <w:tc>
           <w:tcPr>
             <w:tcW w:w="3200" w:type="dxa"/>
@@ -28028,12 +27848,6 @@
         </w:tc>
       </w:tr>
       <w:tr>
-        <w:tblPrEx>
-          <w:tblCellMar>
-            <w:top w:w="0" w:type="dxa"/>
-            <w:bottom w:w="0" w:type="dxa"/>
-          </w:tblCellMar>
-        </w:tblPrEx>
         <w:tc>
           <w:tcPr>
             <w:tcW w:w="3200" w:type="dxa"/>
@@ -28278,12 +28092,6 @@
         </w:tc>
       </w:tr>
       <w:tr>
-        <w:tblPrEx>
-          <w:tblCellMar>
-            <w:top w:w="0" w:type="dxa"/>
-            <w:bottom w:w="0" w:type="dxa"/>
-          </w:tblCellMar>
-        </w:tblPrEx>
         <w:tc>
           <w:tcPr>
             <w:tcW w:w="3200" w:type="dxa"/>
@@ -28528,12 +28336,6 @@
         </w:tc>
       </w:tr>
       <w:tr>
-        <w:tblPrEx>
-          <w:tblCellMar>
-            <w:top w:w="0" w:type="dxa"/>
-            <w:bottom w:w="0" w:type="dxa"/>
-          </w:tblCellMar>
-        </w:tblPrEx>
         <w:tc>
           <w:tcPr>
             <w:tcW w:w="3200" w:type="dxa"/>
@@ -28884,12 +28686,6 @@
         <w:gridCol w:w="4120"/>
       </w:tblGrid>
       <w:tr>
-        <w:tblPrEx>
-          <w:tblCellMar>
-            <w:top w:w="0" w:type="dxa"/>
-            <w:bottom w:w="0" w:type="dxa"/>
-          </w:tblCellMar>
-        </w:tblPrEx>
         <w:tc>
           <w:tcPr>
             <w:tcW w:w="13680" w:type="dxa"/>
@@ -28925,12 +28721,6 @@
         </w:tc>
       </w:tr>
       <w:tr>
-        <w:tblPrEx>
-          <w:tblCellMar>
-            <w:top w:w="0" w:type="dxa"/>
-            <w:bottom w:w="0" w:type="dxa"/>
-          </w:tblCellMar>
-        </w:tblPrEx>
         <w:tc>
           <w:tcPr>
             <w:tcW w:w="3200" w:type="dxa"/>
@@ -29103,12 +28893,6 @@
         </w:tc>
       </w:tr>
       <w:tr>
-        <w:tblPrEx>
-          <w:tblCellMar>
-            <w:top w:w="0" w:type="dxa"/>
-            <w:bottom w:w="0" w:type="dxa"/>
-          </w:tblCellMar>
-        </w:tblPrEx>
         <w:tc>
           <w:tcPr>
             <w:tcW w:w="3200" w:type="dxa"/>
@@ -29371,12 +29155,6 @@
         </w:tc>
       </w:tr>
       <w:tr>
-        <w:tblPrEx>
-          <w:tblCellMar>
-            <w:top w:w="0" w:type="dxa"/>
-            <w:bottom w:w="0" w:type="dxa"/>
-          </w:tblCellMar>
-        </w:tblPrEx>
         <w:tc>
           <w:tcPr>
             <w:tcW w:w="3200" w:type="dxa"/>
@@ -29667,12 +29445,6 @@
         </w:tc>
       </w:tr>
       <w:tr>
-        <w:tblPrEx>
-          <w:tblCellMar>
-            <w:top w:w="0" w:type="dxa"/>
-            <w:bottom w:w="0" w:type="dxa"/>
-          </w:tblCellMar>
-        </w:tblPrEx>
         <w:tc>
           <w:tcPr>
             <w:tcW w:w="3200" w:type="dxa"/>
@@ -29917,12 +29689,6 @@
         </w:tc>
       </w:tr>
       <w:tr>
-        <w:tblPrEx>
-          <w:tblCellMar>
-            <w:top w:w="0" w:type="dxa"/>
-            <w:bottom w:w="0" w:type="dxa"/>
-          </w:tblCellMar>
-        </w:tblPrEx>
         <w:tc>
           <w:tcPr>
             <w:tcW w:w="3200" w:type="dxa"/>
@@ -30235,12 +30001,6 @@
         <w:gridCol w:w="4200"/>
       </w:tblGrid>
       <w:tr>
-        <w:tblPrEx>
-          <w:tblCellMar>
-            <w:top w:w="0" w:type="dxa"/>
-            <w:bottom w:w="0" w:type="dxa"/>
-          </w:tblCellMar>
-        </w:tblPrEx>
         <w:tc>
           <w:tcPr>
             <w:tcW w:w="13680" w:type="dxa"/>
@@ -30278,12 +30038,6 @@
         </w:tc>
       </w:tr>
       <w:tr>
-        <w:tblPrEx>
-          <w:tblCellMar>
-            <w:top w:w="0" w:type="dxa"/>
-            <w:bottom w:w="0" w:type="dxa"/>
-          </w:tblCellMar>
-        </w:tblPrEx>
         <w:tc>
           <w:tcPr>
             <w:tcW w:w="3000" w:type="dxa"/>
@@ -30422,12 +30176,6 @@
         </w:tc>
       </w:tr>
       <w:tr>
-        <w:tblPrEx>
-          <w:tblCellMar>
-            <w:top w:w="0" w:type="dxa"/>
-            <w:bottom w:w="0" w:type="dxa"/>
-          </w:tblCellMar>
-        </w:tblPrEx>
         <w:tc>
           <w:tcPr>
             <w:tcW w:w="3000" w:type="dxa"/>
@@ -30548,12 +30296,6 @@
         </w:tc>
       </w:tr>
       <w:tr>
-        <w:tblPrEx>
-          <w:tblCellMar>
-            <w:top w:w="0" w:type="dxa"/>
-            <w:bottom w:w="0" w:type="dxa"/>
-          </w:tblCellMar>
-        </w:tblPrEx>
         <w:tc>
           <w:tcPr>
             <w:tcW w:w="3000" w:type="dxa"/>
@@ -30674,12 +30416,6 @@
         </w:tc>
       </w:tr>
       <w:tr>
-        <w:tblPrEx>
-          <w:tblCellMar>
-            <w:top w:w="0" w:type="dxa"/>
-            <w:bottom w:w="0" w:type="dxa"/>
-          </w:tblCellMar>
-        </w:tblPrEx>
         <w:tc>
           <w:tcPr>
             <w:tcW w:w="3000" w:type="dxa"/>
@@ -30822,12 +30558,6 @@
         </w:tc>
       </w:tr>
       <w:tr>
-        <w:tblPrEx>
-          <w:tblCellMar>
-            <w:top w:w="0" w:type="dxa"/>
-            <w:bottom w:w="0" w:type="dxa"/>
-          </w:tblCellMar>
-        </w:tblPrEx>
         <w:tc>
           <w:tcPr>
             <w:tcW w:w="3000" w:type="dxa"/>
@@ -30997,12 +30727,6 @@
         <w:gridCol w:w="4120"/>
       </w:tblGrid>
       <w:tr>
-        <w:tblPrEx>
-          <w:tblCellMar>
-            <w:top w:w="0" w:type="dxa"/>
-            <w:bottom w:w="0" w:type="dxa"/>
-          </w:tblCellMar>
-        </w:tblPrEx>
         <w:tc>
           <w:tcPr>
             <w:tcW w:w="13680" w:type="dxa"/>
@@ -31038,12 +30762,6 @@
         </w:tc>
       </w:tr>
       <w:tr>
-        <w:tblPrEx>
-          <w:tblCellMar>
-            <w:top w:w="0" w:type="dxa"/>
-            <w:bottom w:w="0" w:type="dxa"/>
-          </w:tblCellMar>
-        </w:tblPrEx>
         <w:tc>
           <w:tcPr>
             <w:tcW w:w="3200" w:type="dxa"/>
@@ -31216,12 +30934,6 @@
         </w:tc>
       </w:tr>
       <w:tr>
-        <w:tblPrEx>
-          <w:tblCellMar>
-            <w:top w:w="0" w:type="dxa"/>
-            <w:bottom w:w="0" w:type="dxa"/>
-          </w:tblCellMar>
-        </w:tblPrEx>
         <w:tc>
           <w:tcPr>
             <w:tcW w:w="3200" w:type="dxa"/>
@@ -31394,12 +31106,6 @@
         </w:tc>
       </w:tr>
       <w:tr>
-        <w:tblPrEx>
-          <w:tblCellMar>
-            <w:top w:w="0" w:type="dxa"/>
-            <w:bottom w:w="0" w:type="dxa"/>
-          </w:tblCellMar>
-        </w:tblPrEx>
         <w:tc>
           <w:tcPr>
             <w:tcW w:w="3200" w:type="dxa"/>
@@ -31572,12 +31278,6 @@
         </w:tc>
       </w:tr>
       <w:tr>
-        <w:tblPrEx>
-          <w:tblCellMar>
-            <w:top w:w="0" w:type="dxa"/>
-            <w:bottom w:w="0" w:type="dxa"/>
-          </w:tblCellMar>
-        </w:tblPrEx>
         <w:tc>
           <w:tcPr>
             <w:tcW w:w="3200" w:type="dxa"/>
@@ -31857,12 +31557,6 @@
         <w:gridCol w:w="4120"/>
       </w:tblGrid>
       <w:tr>
-        <w:tblPrEx>
-          <w:tblCellMar>
-            <w:top w:w="0" w:type="dxa"/>
-            <w:bottom w:w="0" w:type="dxa"/>
-          </w:tblCellMar>
-        </w:tblPrEx>
         <w:tc>
           <w:tcPr>
             <w:tcW w:w="13680" w:type="dxa"/>
@@ -31898,12 +31592,6 @@
         </w:tc>
       </w:tr>
       <w:tr>
-        <w:tblPrEx>
-          <w:tblCellMar>
-            <w:top w:w="0" w:type="dxa"/>
-            <w:bottom w:w="0" w:type="dxa"/>
-          </w:tblCellMar>
-        </w:tblPrEx>
         <w:tc>
           <w:tcPr>
             <w:tcW w:w="3200" w:type="dxa"/>
@@ -32076,12 +31764,6 @@
         </w:tc>
       </w:tr>
       <w:tr>
-        <w:tblPrEx>
-          <w:tblCellMar>
-            <w:top w:w="0" w:type="dxa"/>
-            <w:bottom w:w="0" w:type="dxa"/>
-          </w:tblCellMar>
-        </w:tblPrEx>
         <w:tc>
           <w:tcPr>
             <w:tcW w:w="3200" w:type="dxa"/>
@@ -32254,12 +31936,6 @@
         </w:tc>
       </w:tr>
       <w:tr>
-        <w:tblPrEx>
-          <w:tblCellMar>
-            <w:top w:w="0" w:type="dxa"/>
-            <w:bottom w:w="0" w:type="dxa"/>
-          </w:tblCellMar>
-        </w:tblPrEx>
         <w:tc>
           <w:tcPr>
             <w:tcW w:w="3200" w:type="dxa"/>
@@ -32432,12 +32108,6 @@
         </w:tc>
       </w:tr>
       <w:tr>
-        <w:tblPrEx>
-          <w:tblCellMar>
-            <w:top w:w="0" w:type="dxa"/>
-            <w:bottom w:w="0" w:type="dxa"/>
-          </w:tblCellMar>
-        </w:tblPrEx>
         <w:tc>
           <w:tcPr>
             <w:tcW w:w="3200" w:type="dxa"/>
@@ -32698,12 +32368,6 @@
         <w:gridCol w:w="1369"/>
       </w:tblGrid>
       <w:tr>
-        <w:tblPrEx>
-          <w:tblCellMar>
-            <w:top w:w="0" w:type="dxa"/>
-            <w:bottom w:w="0" w:type="dxa"/>
-          </w:tblCellMar>
-        </w:tblPrEx>
         <w:tc>
           <w:tcPr>
             <w:tcW w:w="13680" w:type="dxa"/>
@@ -32741,12 +32405,6 @@
         </w:tc>
       </w:tr>
       <w:tr>
-        <w:tblPrEx>
-          <w:tblCellMar>
-            <w:top w:w="0" w:type="dxa"/>
-            <w:bottom w:w="0" w:type="dxa"/>
-          </w:tblCellMar>
-        </w:tblPrEx>
         <w:tc>
           <w:tcPr>
             <w:tcW w:w="1600" w:type="dxa"/>
@@ -33123,12 +32781,6 @@
         </w:tc>
       </w:tr>
       <w:tr>
-        <w:tblPrEx>
-          <w:tblCellMar>
-            <w:top w:w="0" w:type="dxa"/>
-            <w:bottom w:w="0" w:type="dxa"/>
-          </w:tblCellMar>
-        </w:tblPrEx>
         <w:tc>
           <w:tcPr>
             <w:tcW w:w="1600" w:type="dxa"/>
@@ -33504,12 +33156,6 @@
         </w:tc>
       </w:tr>
       <w:tr>
-        <w:tblPrEx>
-          <w:tblCellMar>
-            <w:top w:w="0" w:type="dxa"/>
-            <w:bottom w:w="0" w:type="dxa"/>
-          </w:tblCellMar>
-        </w:tblPrEx>
         <w:tc>
           <w:tcPr>
             <w:tcW w:w="1600" w:type="dxa"/>
@@ -33944,12 +33590,6 @@
         <w:gridCol w:w="3080"/>
       </w:tblGrid>
       <w:tr>
-        <w:tblPrEx>
-          <w:tblCellMar>
-            <w:top w:w="0" w:type="dxa"/>
-            <w:bottom w:w="0" w:type="dxa"/>
-          </w:tblCellMar>
-        </w:tblPrEx>
         <w:tc>
           <w:tcPr>
             <w:tcW w:w="13680" w:type="dxa"/>
@@ -33985,12 +33625,6 @@
         </w:tc>
       </w:tr>
       <w:tr>
-        <w:tblPrEx>
-          <w:tblCellMar>
-            <w:top w:w="0" w:type="dxa"/>
-            <w:bottom w:w="0" w:type="dxa"/>
-          </w:tblCellMar>
-        </w:tblPrEx>
         <w:tc>
           <w:tcPr>
             <w:tcW w:w="2480" w:type="dxa"/>
@@ -34163,12 +33797,6 @@
         </w:tc>
       </w:tr>
       <w:tr>
-        <w:tblPrEx>
-          <w:tblCellMar>
-            <w:top w:w="0" w:type="dxa"/>
-            <w:bottom w:w="0" w:type="dxa"/>
-          </w:tblCellMar>
-        </w:tblPrEx>
         <w:tc>
           <w:tcPr>
             <w:tcW w:w="2480" w:type="dxa"/>
@@ -34345,12 +33973,6 @@
         </w:tc>
       </w:tr>
       <w:tr>
-        <w:tblPrEx>
-          <w:tblCellMar>
-            <w:top w:w="0" w:type="dxa"/>
-            <w:bottom w:w="0" w:type="dxa"/>
-          </w:tblCellMar>
-        </w:tblPrEx>
         <w:tc>
           <w:tcPr>
             <w:tcW w:w="2480" w:type="dxa"/>
@@ -34486,12 +34108,6 @@
         </w:tc>
       </w:tr>
       <w:tr>
-        <w:tblPrEx>
-          <w:tblCellMar>
-            <w:top w:w="0" w:type="dxa"/>
-            <w:bottom w:w="0" w:type="dxa"/>
-          </w:tblCellMar>
-        </w:tblPrEx>
         <w:tc>
           <w:tcPr>
             <w:tcW w:w="2480" w:type="dxa"/>
@@ -34650,12 +34266,6 @@
         </w:tc>
       </w:tr>
       <w:tr>
-        <w:tblPrEx>
-          <w:tblCellMar>
-            <w:top w:w="0" w:type="dxa"/>
-            <w:bottom w:w="0" w:type="dxa"/>
-          </w:tblCellMar>
-        </w:tblPrEx>
         <w:tc>
           <w:tcPr>
             <w:tcW w:w="2480" w:type="dxa"/>
@@ -34782,12 +34392,6 @@
         </w:tc>
       </w:tr>
       <w:tr>
-        <w:tblPrEx>
-          <w:tblCellMar>
-            <w:top w:w="0" w:type="dxa"/>
-            <w:bottom w:w="0" w:type="dxa"/>
-          </w:tblCellMar>
-        </w:tblPrEx>
         <w:tc>
           <w:tcPr>
             <w:tcW w:w="2480" w:type="dxa"/>
@@ -34962,12 +34566,6 @@
         </w:tc>
       </w:tr>
       <w:tr>
-        <w:tblPrEx>
-          <w:tblCellMar>
-            <w:top w:w="0" w:type="dxa"/>
-            <w:bottom w:w="0" w:type="dxa"/>
-          </w:tblCellMar>
-        </w:tblPrEx>
         <w:tc>
           <w:tcPr>
             <w:tcW w:w="2480" w:type="dxa"/>
@@ -35094,12 +34692,6 @@
         </w:tc>
       </w:tr>
       <w:tr>
-        <w:tblPrEx>
-          <w:tblCellMar>
-            <w:top w:w="0" w:type="dxa"/>
-            <w:bottom w:w="0" w:type="dxa"/>
-          </w:tblCellMar>
-        </w:tblPrEx>
         <w:tc>
           <w:tcPr>
             <w:tcW w:w="2480" w:type="dxa"/>
@@ -35247,12 +34839,6 @@
         </w:tc>
       </w:tr>
       <w:tr>
-        <w:tblPrEx>
-          <w:tblCellMar>
-            <w:top w:w="0" w:type="dxa"/>
-            <w:bottom w:w="0" w:type="dxa"/>
-          </w:tblCellMar>
-        </w:tblPrEx>
         <w:tc>
           <w:tcPr>
             <w:tcW w:w="2480" w:type="dxa"/>
@@ -35452,12 +35038,6 @@
         </w:tc>
       </w:tr>
       <w:tr>
-        <w:tblPrEx>
-          <w:tblCellMar>
-            <w:top w:w="0" w:type="dxa"/>
-            <w:bottom w:w="0" w:type="dxa"/>
-          </w:tblCellMar>
-        </w:tblPrEx>
         <w:tc>
           <w:tcPr>
             <w:tcW w:w="2480" w:type="dxa"/>
@@ -35605,12 +35185,6 @@
         </w:tc>
       </w:tr>
       <w:tr>
-        <w:tblPrEx>
-          <w:tblCellMar>
-            <w:top w:w="0" w:type="dxa"/>
-            <w:bottom w:w="0" w:type="dxa"/>
-          </w:tblCellMar>
-        </w:tblPrEx>
         <w:tc>
           <w:tcPr>
             <w:tcW w:w="2480" w:type="dxa"/>
@@ -35985,12 +35559,6 @@
         <w:gridCol w:w="2567"/>
       </w:tblGrid>
       <w:tr>
-        <w:tblPrEx>
-          <w:tblCellMar>
-            <w:top w:w="0" w:type="dxa"/>
-            <w:bottom w:w="0" w:type="dxa"/>
-          </w:tblCellMar>
-        </w:tblPrEx>
         <w:tc>
           <w:tcPr>
             <w:tcW w:w="13680" w:type="dxa"/>
@@ -36026,12 +35594,6 @@
         </w:tc>
       </w:tr>
       <w:tr>
-        <w:tblPrEx>
-          <w:tblCellMar>
-            <w:top w:w="0" w:type="dxa"/>
-            <w:bottom w:w="0" w:type="dxa"/>
-          </w:tblCellMar>
-        </w:tblPrEx>
         <w:tc>
           <w:tcPr>
             <w:tcW w:w="2200" w:type="dxa"/>
@@ -36396,12 +35958,6 @@
         </w:tc>
       </w:tr>
       <w:tr>
-        <w:tblPrEx>
-          <w:tblCellMar>
-            <w:top w:w="0" w:type="dxa"/>
-            <w:bottom w:w="0" w:type="dxa"/>
-          </w:tblCellMar>
-        </w:tblPrEx>
         <w:tc>
           <w:tcPr>
             <w:tcW w:w="2200" w:type="dxa"/>
@@ -36724,12 +36280,6 @@
         </w:tc>
       </w:tr>
       <w:tr>
-        <w:tblPrEx>
-          <w:tblCellMar>
-            <w:top w:w="0" w:type="dxa"/>
-            <w:bottom w:w="0" w:type="dxa"/>
-          </w:tblCellMar>
-        </w:tblPrEx>
         <w:tc>
           <w:tcPr>
             <w:tcW w:w="2200" w:type="dxa"/>
@@ -37038,12 +36588,6 @@
         </w:tc>
       </w:tr>
       <w:tr>
-        <w:tblPrEx>
-          <w:tblCellMar>
-            <w:top w:w="0" w:type="dxa"/>
-            <w:bottom w:w="0" w:type="dxa"/>
-          </w:tblCellMar>
-        </w:tblPrEx>
         <w:tc>
           <w:tcPr>
             <w:tcW w:w="2200" w:type="dxa"/>
@@ -37305,12 +36849,6 @@
         </w:tc>
       </w:tr>
       <w:tr>
-        <w:tblPrEx>
-          <w:tblCellMar>
-            <w:top w:w="0" w:type="dxa"/>
-            <w:bottom w:w="0" w:type="dxa"/>
-          </w:tblCellMar>
-        </w:tblPrEx>
         <w:tc>
           <w:tcPr>
             <w:tcW w:w="2200" w:type="dxa"/>
@@ -37572,12 +37110,6 @@
         </w:tc>
       </w:tr>
       <w:tr>
-        <w:tblPrEx>
-          <w:tblCellMar>
-            <w:top w:w="0" w:type="dxa"/>
-            <w:bottom w:w="0" w:type="dxa"/>
-          </w:tblCellMar>
-        </w:tblPrEx>
         <w:tc>
           <w:tcPr>
             <w:tcW w:w="2200" w:type="dxa"/>
@@ -37928,12 +37460,6 @@
         </w:tc>
       </w:tr>
       <w:tr>
-        <w:tblPrEx>
-          <w:tblCellMar>
-            <w:top w:w="0" w:type="dxa"/>
-            <w:bottom w:w="0" w:type="dxa"/>
-          </w:tblCellMar>
-        </w:tblPrEx>
         <w:tc>
           <w:tcPr>
             <w:tcW w:w="2200" w:type="dxa"/>
@@ -38262,12 +37788,6 @@
         </w:tc>
       </w:tr>
       <w:tr>
-        <w:tblPrEx>
-          <w:tblCellMar>
-            <w:top w:w="0" w:type="dxa"/>
-            <w:bottom w:w="0" w:type="dxa"/>
-          </w:tblCellMar>
-        </w:tblPrEx>
         <w:tc>
           <w:tcPr>
             <w:tcW w:w="2200" w:type="dxa"/>
@@ -38549,12 +38069,6 @@
         </w:tc>
       </w:tr>
       <w:tr>
-        <w:tblPrEx>
-          <w:tblCellMar>
-            <w:top w:w="0" w:type="dxa"/>
-            <w:bottom w:w="0" w:type="dxa"/>
-          </w:tblCellMar>
-        </w:tblPrEx>
         <w:tc>
           <w:tcPr>
             <w:tcW w:w="2200" w:type="dxa"/>
@@ -38810,12 +38324,6 @@
         </w:tc>
       </w:tr>
       <w:tr>
-        <w:tblPrEx>
-          <w:tblCellMar>
-            <w:top w:w="0" w:type="dxa"/>
-            <w:bottom w:w="0" w:type="dxa"/>
-          </w:tblCellMar>
-        </w:tblPrEx>
         <w:tc>
           <w:tcPr>
             <w:tcW w:w="2200" w:type="dxa"/>
@@ -39202,12 +38710,6 @@
         </w:tc>
       </w:tr>
       <w:tr>
-        <w:tblPrEx>
-          <w:tblCellMar>
-            <w:top w:w="0" w:type="dxa"/>
-            <w:bottom w:w="0" w:type="dxa"/>
-          </w:tblCellMar>
-        </w:tblPrEx>
         <w:tc>
           <w:tcPr>
             <w:tcW w:w="2200" w:type="dxa"/>
@@ -39472,12 +38974,6 @@
         </w:tc>
       </w:tr>
       <w:tr>
-        <w:tblPrEx>
-          <w:tblCellMar>
-            <w:top w:w="0" w:type="dxa"/>
-            <w:bottom w:w="0" w:type="dxa"/>
-          </w:tblCellMar>
-        </w:tblPrEx>
         <w:tc>
           <w:tcPr>
             <w:tcW w:w="2200" w:type="dxa"/>
@@ -39733,12 +39229,6 @@
         </w:tc>
       </w:tr>
       <w:tr>
-        <w:tblPrEx>
-          <w:tblCellMar>
-            <w:top w:w="0" w:type="dxa"/>
-            <w:bottom w:w="0" w:type="dxa"/>
-          </w:tblCellMar>
-        </w:tblPrEx>
         <w:tc>
           <w:tcPr>
             <w:tcW w:w="2200" w:type="dxa"/>
@@ -39994,12 +39484,6 @@
         </w:tc>
       </w:tr>
       <w:tr>
-        <w:tblPrEx>
-          <w:tblCellMar>
-            <w:top w:w="0" w:type="dxa"/>
-            <w:bottom w:w="0" w:type="dxa"/>
-          </w:tblCellMar>
-        </w:tblPrEx>
         <w:tc>
           <w:tcPr>
             <w:tcW w:w="2200" w:type="dxa"/>
@@ -40386,12 +39870,6 @@
         </w:tc>
       </w:tr>
       <w:tr>
-        <w:tblPrEx>
-          <w:tblCellMar>
-            <w:top w:w="0" w:type="dxa"/>
-            <w:bottom w:w="0" w:type="dxa"/>
-          </w:tblCellMar>
-        </w:tblPrEx>
         <w:tc>
           <w:tcPr>
             <w:tcW w:w="2200" w:type="dxa"/>
@@ -40700,12 +40178,6 @@
         </w:tc>
       </w:tr>
       <w:tr>
-        <w:tblPrEx>
-          <w:tblCellMar>
-            <w:top w:w="0" w:type="dxa"/>
-            <w:bottom w:w="0" w:type="dxa"/>
-          </w:tblCellMar>
-        </w:tblPrEx>
         <w:tc>
           <w:tcPr>
             <w:tcW w:w="2200" w:type="dxa"/>
@@ -40961,12 +40433,6 @@
         </w:tc>
       </w:tr>
       <w:tr>
-        <w:tblPrEx>
-          <w:tblCellMar>
-            <w:top w:w="0" w:type="dxa"/>
-            <w:bottom w:w="0" w:type="dxa"/>
-          </w:tblCellMar>
-        </w:tblPrEx>
         <w:tc>
           <w:tcPr>
             <w:tcW w:w="2200" w:type="dxa"/>
@@ -41222,12 +40688,6 @@
         </w:tc>
       </w:tr>
       <w:tr>
-        <w:tblPrEx>
-          <w:tblCellMar>
-            <w:top w:w="0" w:type="dxa"/>
-            <w:bottom w:w="0" w:type="dxa"/>
-          </w:tblCellMar>
-        </w:tblPrEx>
         <w:tc>
           <w:tcPr>
             <w:tcW w:w="2200" w:type="dxa"/>
@@ -41578,12 +41038,6 @@
         </w:tc>
       </w:tr>
       <w:tr>
-        <w:tblPrEx>
-          <w:tblCellMar>
-            <w:top w:w="0" w:type="dxa"/>
-            <w:bottom w:w="0" w:type="dxa"/>
-          </w:tblCellMar>
-        </w:tblPrEx>
         <w:tc>
           <w:tcPr>
             <w:tcW w:w="2200" w:type="dxa"/>
@@ -41848,12 +41302,6 @@
         </w:tc>
       </w:tr>
       <w:tr>
-        <w:tblPrEx>
-          <w:tblCellMar>
-            <w:top w:w="0" w:type="dxa"/>
-            <w:bottom w:w="0" w:type="dxa"/>
-          </w:tblCellMar>
-        </w:tblPrEx>
         <w:tc>
           <w:tcPr>
             <w:tcW w:w="2200" w:type="dxa"/>
@@ -42109,12 +41557,6 @@
         </w:tc>
       </w:tr>
       <w:tr>
-        <w:tblPrEx>
-          <w:tblCellMar>
-            <w:top w:w="0" w:type="dxa"/>
-            <w:bottom w:w="0" w:type="dxa"/>
-          </w:tblCellMar>
-        </w:tblPrEx>
         <w:tc>
           <w:tcPr>
             <w:tcW w:w="2200" w:type="dxa"/>
@@ -42370,12 +41812,6 @@
         </w:tc>
       </w:tr>
       <w:tr>
-        <w:tblPrEx>
-          <w:tblCellMar>
-            <w:top w:w="0" w:type="dxa"/>
-            <w:bottom w:w="0" w:type="dxa"/>
-          </w:tblCellMar>
-        </w:tblPrEx>
         <w:tc>
           <w:tcPr>
             <w:tcW w:w="2200" w:type="dxa"/>
@@ -42708,12 +42144,6 @@
         </w:tc>
       </w:tr>
       <w:tr>
-        <w:tblPrEx>
-          <w:tblCellMar>
-            <w:top w:w="0" w:type="dxa"/>
-            <w:bottom w:w="0" w:type="dxa"/>
-          </w:tblCellMar>
-        </w:tblPrEx>
         <w:tc>
           <w:tcPr>
             <w:tcW w:w="2200" w:type="dxa"/>
@@ -42978,12 +42408,6 @@
         </w:tc>
       </w:tr>
       <w:tr>
-        <w:tblPrEx>
-          <w:tblCellMar>
-            <w:top w:w="0" w:type="dxa"/>
-            <w:bottom w:w="0" w:type="dxa"/>
-          </w:tblCellMar>
-        </w:tblPrEx>
         <w:tc>
           <w:tcPr>
             <w:tcW w:w="2200" w:type="dxa"/>
@@ -43239,12 +42663,6 @@
         </w:tc>
       </w:tr>
       <w:tr>
-        <w:tblPrEx>
-          <w:tblCellMar>
-            <w:top w:w="0" w:type="dxa"/>
-            <w:bottom w:w="0" w:type="dxa"/>
-          </w:tblCellMar>
-        </w:tblPrEx>
         <w:tc>
           <w:tcPr>
             <w:tcW w:w="2200" w:type="dxa"/>
@@ -43647,12 +43065,6 @@
         <w:gridCol w:w="5160"/>
       </w:tblGrid>
       <w:tr>
-        <w:tblPrEx>
-          <w:tblCellMar>
-            <w:top w:w="0" w:type="dxa"/>
-            <w:bottom w:w="0" w:type="dxa"/>
-          </w:tblCellMar>
-        </w:tblPrEx>
         <w:tc>
           <w:tcPr>
             <w:tcW w:w="13680" w:type="dxa"/>
@@ -43690,12 +43102,6 @@
         </w:tc>
       </w:tr>
       <w:tr>
-        <w:tblPrEx>
-          <w:tblCellMar>
-            <w:top w:w="0" w:type="dxa"/>
-            <w:bottom w:w="0" w:type="dxa"/>
-          </w:tblCellMar>
-        </w:tblPrEx>
         <w:tc>
           <w:tcPr>
             <w:tcW w:w="3400" w:type="dxa"/>
@@ -43834,12 +43240,6 @@
         </w:tc>
       </w:tr>
       <w:tr>
-        <w:tblPrEx>
-          <w:tblCellMar>
-            <w:top w:w="0" w:type="dxa"/>
-            <w:bottom w:w="0" w:type="dxa"/>
-          </w:tblCellMar>
-        </w:tblPrEx>
         <w:tc>
           <w:tcPr>
             <w:tcW w:w="3400" w:type="dxa"/>
@@ -43982,12 +43382,6 @@
         </w:tc>
       </w:tr>
       <w:tr>
-        <w:tblPrEx>
-          <w:tblCellMar>
-            <w:top w:w="0" w:type="dxa"/>
-            <w:bottom w:w="0" w:type="dxa"/>
-          </w:tblCellMar>
-        </w:tblPrEx>
         <w:tc>
           <w:tcPr>
             <w:tcW w:w="3400" w:type="dxa"/>
@@ -44108,12 +43502,6 @@
         </w:tc>
       </w:tr>
       <w:tr>
-        <w:tblPrEx>
-          <w:tblCellMar>
-            <w:top w:w="0" w:type="dxa"/>
-            <w:bottom w:w="0" w:type="dxa"/>
-          </w:tblCellMar>
-        </w:tblPrEx>
         <w:tc>
           <w:tcPr>
             <w:tcW w:w="3400" w:type="dxa"/>
@@ -44234,12 +43622,6 @@
         </w:tc>
       </w:tr>
       <w:tr>
-        <w:tblPrEx>
-          <w:tblCellMar>
-            <w:top w:w="0" w:type="dxa"/>
-            <w:bottom w:w="0" w:type="dxa"/>
-          </w:tblCellMar>
-        </w:tblPrEx>
         <w:tc>
           <w:tcPr>
             <w:tcW w:w="3400" w:type="dxa"/>
@@ -44360,12 +43742,6 @@
         </w:tc>
       </w:tr>
       <w:tr>
-        <w:tblPrEx>
-          <w:tblCellMar>
-            <w:top w:w="0" w:type="dxa"/>
-            <w:bottom w:w="0" w:type="dxa"/>
-          </w:tblCellMar>
-        </w:tblPrEx>
         <w:tc>
           <w:tcPr>
             <w:tcW w:w="3400" w:type="dxa"/>
@@ -44538,12 +43914,6 @@
         <w:gridCol w:w="5200"/>
       </w:tblGrid>
       <w:tr>
-        <w:tblPrEx>
-          <w:tblCellMar>
-            <w:top w:w="0" w:type="dxa"/>
-            <w:bottom w:w="0" w:type="dxa"/>
-          </w:tblCellMar>
-        </w:tblPrEx>
         <w:tc>
           <w:tcPr>
             <w:tcW w:w="13680" w:type="dxa"/>
@@ -44581,12 +43951,6 @@
         </w:tc>
       </w:tr>
       <w:tr>
-        <w:tblPrEx>
-          <w:tblCellMar>
-            <w:top w:w="0" w:type="dxa"/>
-            <w:bottom w:w="0" w:type="dxa"/>
-          </w:tblCellMar>
-        </w:tblPrEx>
         <w:tc>
           <w:tcPr>
             <w:tcW w:w="3400" w:type="dxa"/>
@@ -44691,12 +44055,6 @@
         </w:tc>
       </w:tr>
       <w:tr>
-        <w:tblPrEx>
-          <w:tblCellMar>
-            <w:top w:w="0" w:type="dxa"/>
-            <w:bottom w:w="0" w:type="dxa"/>
-          </w:tblCellMar>
-        </w:tblPrEx>
         <w:tc>
           <w:tcPr>
             <w:tcW w:w="3400" w:type="dxa"/>
@@ -44788,12 +44146,6 @@
         </w:tc>
       </w:tr>
       <w:tr>
-        <w:tblPrEx>
-          <w:tblCellMar>
-            <w:top w:w="0" w:type="dxa"/>
-            <w:bottom w:w="0" w:type="dxa"/>
-          </w:tblCellMar>
-        </w:tblPrEx>
         <w:tc>
           <w:tcPr>
             <w:tcW w:w="3400" w:type="dxa"/>
@@ -44885,12 +44237,6 @@
         </w:tc>
       </w:tr>
       <w:tr>
-        <w:tblPrEx>
-          <w:tblCellMar>
-            <w:top w:w="0" w:type="dxa"/>
-            <w:bottom w:w="0" w:type="dxa"/>
-          </w:tblCellMar>
-        </w:tblPrEx>
         <w:tc>
           <w:tcPr>
             <w:tcW w:w="3400" w:type="dxa"/>
@@ -44982,22 +44328,17 @@
         </w:tc>
       </w:tr>
     </w:tbl>
-    <w:p>
-      <w:pPr>
-        <w:spacing w:before="80" w:after="80"/>
-      </w:pPr>
-    </w:p>
-    <w:p>
-      <w:pPr>
-        <w:spacing w:before="80" w:after="80"/>
-      </w:pPr>
-    </w:p>
     <w:p>
       <w:pPr>
         <w:shd w:val="clear" w:color="auto" w:fill="D6E4F0"/>
         <w:spacing w:before="200" w:after="100"/>
         <w:ind w:left="200" w:right="200"/>
         <w:jc w:val="center"/>
+        <w:rPr>
+          <w:color w:val="555555"/>
+          <w:sz w:val="15"/>
+          <w:szCs w:val="15"/>
+        </w:rPr>
       </w:pPr>
       <w:r>
         <w:rPr>
@@ -45011,12 +44352,242 @@
     <w:p>
       <w:pPr>
         <w:rPr>
-          <w:rFonts w:ascii="Calibri" w:eastAsia="Calibri" w:hAnsi="Calibri" w:cs="Calibri"/>
+          <w:color w:val="555555"/>
+          <w:sz w:val="15"/>
+          <w:szCs w:val="15"/>
         </w:rPr>
       </w:pPr>
+      <w:r>
+        <w:rPr>
+          <w:color w:val="555555"/>
+          <w:sz w:val="15"/>
+          <w:szCs w:val="15"/>
+        </w:rPr>
+        <w:br w:type="page"/>
+      </w:r>
+    </w:p>
+    <w:p>
+      <w:pPr>
+        <w:pStyle w:val="Ttulo1"/>
+        <w:pBdr>
+          <w:bottom w:val="single" w:sz="6" w:space="0" w:color="4472C4"/>
+        </w:pBdr>
+        <w:shd w:val="clear" w:color="auto" w:fill="1F3864"/>
+        <w:ind w:left="200" w:right="200"/>
+      </w:pPr>
+      <w:r>
+        <w:lastRenderedPageBreak/>
+        <w:t>1</w:t>
+      </w:r>
+      <w:r>
+        <w:t>3. Información General</w:t>
+      </w:r>
+    </w:p>
+    <w:p>
+      <w:pPr>
+        <w:jc w:val="center"/>
+        <w:rPr>
+          <w:color w:val="555555"/>
+          <w:sz w:val="15"/>
+          <w:szCs w:val="15"/>
+        </w:rPr>
+      </w:pPr>
+      <w:r>
+        <w:rPr>
+          <w:noProof/>
+        </w:rPr>
+        <w:drawing>
+          <wp:inline distT="0" distB="0" distL="0" distR="0" wp14:anchorId="0BAD85E6" wp14:editId="1333D8EB">
+            <wp:extent cx="9158474" cy="4201886"/>
+            <wp:effectExtent l="0" t="0" r="0" b="1905"/>
+            <wp:docPr id="1" name="Imagen 1"/>
+            <wp:cNvGraphicFramePr>
+              <a:graphicFrameLocks xmlns:a="http://schemas.openxmlformats.org/drawingml/2006/main" noChangeAspect="1"/>
+            </wp:cNvGraphicFramePr>
+            <a:graphic xmlns:a="http://schemas.openxmlformats.org/drawingml/2006/main">
+              <a:graphicData uri="http://schemas.openxmlformats.org/drawingml/2006/picture">
+                <pic:pic xmlns:pic="http://schemas.openxmlformats.org/drawingml/2006/picture">
+                  <pic:nvPicPr>
+                    <pic:cNvPr id="1" name=""/>
+                    <pic:cNvPicPr/>
+                  </pic:nvPicPr>
+                  <pic:blipFill>
+                    <a:blip r:embed="rId13"/>
+                    <a:stretch>
+                      <a:fillRect/>
+                    </a:stretch>
+                  </pic:blipFill>
+                  <pic:spPr>
+                    <a:xfrm>
+                      <a:off x="0" y="0"/>
+                      <a:ext cx="9206180" cy="4223773"/>
+                    </a:xfrm>
+                    <a:prstGeom prst="rect">
+                      <a:avLst/>
+                    </a:prstGeom>
+                  </pic:spPr>
+                </pic:pic>
+              </a:graphicData>
+            </a:graphic>
+          </wp:inline>
+        </w:drawing>
+      </w:r>
+    </w:p>
+    <w:p>
+      <w:pPr>
+        <w:jc w:val="center"/>
+        <w:rPr>
+          <w:color w:val="555555"/>
+          <w:sz w:val="15"/>
+          <w:szCs w:val="15"/>
+        </w:rPr>
+      </w:pPr>
+      <w:r>
+        <w:rPr>
+          <w:noProof/>
+        </w:rPr>
+        <w:lastRenderedPageBreak/>
+        <w:drawing>
+          <wp:inline distT="0" distB="0" distL="0" distR="0" wp14:anchorId="1DCB0A7C" wp14:editId="0FD47A4F">
+            <wp:extent cx="9269409" cy="4223657"/>
+            <wp:effectExtent l="0" t="0" r="1905" b="5715"/>
+            <wp:docPr id="2" name="Imagen 2"/>
+            <wp:cNvGraphicFramePr>
+              <a:graphicFrameLocks xmlns:a="http://schemas.openxmlformats.org/drawingml/2006/main" noChangeAspect="1"/>
+            </wp:cNvGraphicFramePr>
+            <a:graphic xmlns:a="http://schemas.openxmlformats.org/drawingml/2006/main">
+              <a:graphicData uri="http://schemas.openxmlformats.org/drawingml/2006/picture">
+                <pic:pic xmlns:pic="http://schemas.openxmlformats.org/drawingml/2006/picture">
+                  <pic:nvPicPr>
+                    <pic:cNvPr id="1" name=""/>
+                    <pic:cNvPicPr/>
+                  </pic:nvPicPr>
+                  <pic:blipFill>
+                    <a:blip r:embed="rId14"/>
+                    <a:stretch>
+                      <a:fillRect/>
+                    </a:stretch>
+                  </pic:blipFill>
+                  <pic:spPr>
+                    <a:xfrm>
+                      <a:off x="0" y="0"/>
+                      <a:ext cx="9282415" cy="4229583"/>
+                    </a:xfrm>
+                    <a:prstGeom prst="rect">
+                      <a:avLst/>
+                    </a:prstGeom>
+                  </pic:spPr>
+                </pic:pic>
+              </a:graphicData>
+            </a:graphic>
+          </wp:inline>
+        </w:drawing>
+      </w:r>
+    </w:p>
+    <w:p>
+      <w:pPr>
+        <w:jc w:val="center"/>
+        <w:rPr>
+          <w:color w:val="555555"/>
+          <w:sz w:val="15"/>
+          <w:szCs w:val="15"/>
+        </w:rPr>
+      </w:pPr>
+      <w:r>
+        <w:rPr>
+          <w:noProof/>
+        </w:rPr>
+        <w:lastRenderedPageBreak/>
+        <w:drawing>
+          <wp:inline distT="0" distB="0" distL="0" distR="0" wp14:anchorId="2A917DBB" wp14:editId="7345E62E">
+            <wp:extent cx="8863330" cy="4055081"/>
+            <wp:effectExtent l="0" t="0" r="1270" b="0"/>
+            <wp:docPr id="3" name="Imagen 3"/>
+            <wp:cNvGraphicFramePr>
+              <a:graphicFrameLocks xmlns:a="http://schemas.openxmlformats.org/drawingml/2006/main" noChangeAspect="1"/>
+            </wp:cNvGraphicFramePr>
+            <a:graphic xmlns:a="http://schemas.openxmlformats.org/drawingml/2006/main">
+              <a:graphicData uri="http://schemas.openxmlformats.org/drawingml/2006/picture">
+                <pic:pic xmlns:pic="http://schemas.openxmlformats.org/drawingml/2006/picture">
+                  <pic:nvPicPr>
+                    <pic:cNvPr id="1" name=""/>
+                    <pic:cNvPicPr/>
+                  </pic:nvPicPr>
+                  <pic:blipFill>
+                    <a:blip r:embed="rId15"/>
+                    <a:stretch>
+                      <a:fillRect/>
+                    </a:stretch>
+                  </pic:blipFill>
+                  <pic:spPr>
+                    <a:xfrm>
+                      <a:off x="0" y="0"/>
+                      <a:ext cx="8863330" cy="4055081"/>
+                    </a:xfrm>
+                    <a:prstGeom prst="rect">
+                      <a:avLst/>
+                    </a:prstGeom>
+                  </pic:spPr>
+                </pic:pic>
+              </a:graphicData>
+            </a:graphic>
+          </wp:inline>
+        </w:drawing>
+      </w:r>
+    </w:p>
+    <w:p>
+      <w:pPr>
+        <w:jc w:val="center"/>
+        <w:rPr>
+          <w:color w:val="555555"/>
+          <w:sz w:val="15"/>
+          <w:szCs w:val="15"/>
+        </w:rPr>
+      </w:pPr>
+      <w:r>
+        <w:rPr>
+          <w:noProof/>
+        </w:rPr>
+        <w:lastRenderedPageBreak/>
+        <w:drawing>
+          <wp:inline distT="0" distB="0" distL="0" distR="0" wp14:anchorId="35F77594" wp14:editId="48F3A3DB">
+            <wp:extent cx="8863330" cy="4094955"/>
+            <wp:effectExtent l="0" t="0" r="1270" b="0"/>
+            <wp:docPr id="4" name="Imagen 4"/>
+            <wp:cNvGraphicFramePr>
+              <a:graphicFrameLocks xmlns:a="http://schemas.openxmlformats.org/drawingml/2006/main" noChangeAspect="1"/>
+            </wp:cNvGraphicFramePr>
+            <a:graphic xmlns:a="http://schemas.openxmlformats.org/drawingml/2006/main">
+              <a:graphicData uri="http://schemas.openxmlformats.org/drawingml/2006/picture">
+                <pic:pic xmlns:pic="http://schemas.openxmlformats.org/drawingml/2006/picture">
+                  <pic:nvPicPr>
+                    <pic:cNvPr id="1" name=""/>
+                    <pic:cNvPicPr/>
+                  </pic:nvPicPr>
+                  <pic:blipFill>
+                    <a:blip r:embed="rId16"/>
+                    <a:stretch>
+                      <a:fillRect/>
+                    </a:stretch>
+                  </pic:blipFill>
+                  <pic:spPr>
+                    <a:xfrm>
+                      <a:off x="0" y="0"/>
+                      <a:ext cx="8863330" cy="4094955"/>
+                    </a:xfrm>
+                    <a:prstGeom prst="rect">
+                      <a:avLst/>
+                    </a:prstGeom>
+                  </pic:spPr>
+                </pic:pic>
+              </a:graphicData>
+            </a:graphic>
+          </wp:inline>
+        </w:drawing>
+      </w:r>
     </w:p>
     <w:sectPr>
-      <w:footerReference w:type="default" r:id="rId12"/>
+      <w:footerReference w:type="default" r:id="rId17"/>
       <w:pgSz w:w="16838" w:h="11906" w:orient="landscape"/>
       <w:pgMar w:top="1260" w:right="1440" w:bottom="1260" w:left="1440" w:header="708" w:footer="708" w:gutter="0"/>
       <w:cols w:space="720"/>
@@ -46218,6 +45789,30 @@
       <w:rFonts w:asciiTheme="minorHAnsi" w:hAnsiTheme="minorHAnsi"/>
     </w:rPr>
   </w:style>
+  <w:style w:type="character" w:styleId="Mencinsinresolver">
+    <w:name w:val="Unresolved Mention"/>
+    <w:basedOn w:val="Fuentedeprrafopredeter"/>
+    <w:uiPriority w:val="99"/>
+    <w:semiHidden/>
+    <w:unhideWhenUsed/>
+    <w:rsid w:val="00566F44"/>
+    <w:rPr>
+      <w:color w:val="605E5C"/>
+      <w:shd w:val="clear" w:color="auto" w:fill="E1DFDD"/>
+    </w:rPr>
+  </w:style>
+  <w:style w:type="character" w:styleId="Hipervnculovisitado">
+    <w:name w:val="FollowedHyperlink"/>
+    <w:basedOn w:val="Fuentedeprrafopredeter"/>
+    <w:uiPriority w:val="99"/>
+    <w:semiHidden/>
+    <w:unhideWhenUsed/>
+    <w:rsid w:val="00566F44"/>
+    <w:rPr>
+      <w:color w:val="96607D" w:themeColor="followedHyperlink"/>
+      <w:u w:val="single"/>
+    </w:rPr>
+  </w:style>
 </w:styles>
 </file>
 

</xml_diff>

<commit_message>
Added puntuacion & recuento a examenes & enlaces kahoots
</commit_message>
<xml_diff>
--- a/Material_Estudio/resumen_legislacion.docx
+++ b/Material_Estudio/resumen_legislacion.docx
@@ -44346,9 +44346,9 @@
         </w:rPr>
         <w:lastRenderedPageBreak/>
         <w:drawing>
-          <wp:inline distT="0" distB="0" distL="0" distR="0" wp14:anchorId="1DCB0A7C" wp14:editId="0FD47A4F">
-            <wp:extent cx="9269409" cy="4223657"/>
-            <wp:effectExtent l="0" t="0" r="1905" b="5715"/>
+          <wp:inline distT="0" distB="0" distL="0" distR="0" wp14:anchorId="1DCB0A7C" wp14:editId="56678B0C">
+            <wp:extent cx="8982724" cy="4093028"/>
+            <wp:effectExtent l="0" t="0" r="0" b="0"/>
             <wp:docPr id="2" name="Imagen 2"/>
             <wp:cNvGraphicFramePr>
               <a:graphicFrameLocks xmlns:a="http://schemas.openxmlformats.org/drawingml/2006/main" noChangeAspect="1"/>
@@ -44369,7 +44369,7 @@
                   <pic:spPr>
                     <a:xfrm>
                       <a:off x="0" y="0"/>
-                      <a:ext cx="9282415" cy="4229583"/>
+                      <a:ext cx="9085686" cy="4139943"/>
                     </a:xfrm>
                     <a:prstGeom prst="rect">
                       <a:avLst/>
@@ -44581,6 +44581,11 @@
         <w:top w:val="single" w:sz="4" w:space="0" w:color="D6E4F0"/>
       </w:pBdr>
       <w:jc w:val="center"/>
+      <w:rPr>
+        <w:color w:val="888888"/>
+        <w:sz w:val="14"/>
+        <w:szCs w:val="14"/>
+      </w:rPr>
     </w:pPr>
     <w:r>
       <w:rPr>
@@ -44588,7 +44593,23 @@
         <w:sz w:val="14"/>
         <w:szCs w:val="14"/>
       </w:rPr>
-      <w:t xml:space="preserve">Decreto 29/2018, de 17 de abril — Tarifas máximas Canal de Isabel II, S.A.   |   Comunidad de Madrid   |   Pág. </w:t>
+      <w:t xml:space="preserve">Decreto 29/2018, de 17 de abril — Tarifas máximas Canal de Isabel II, S.A. </w:t>
+    </w:r>
+    <w:r>
+      <w:rPr>
+        <w:color w:val="888888"/>
+        <w:sz w:val="14"/>
+        <w:szCs w:val="14"/>
+      </w:rPr>
+      <w:t>e información general</w:t>
+    </w:r>
+    <w:r>
+      <w:rPr>
+        <w:color w:val="888888"/>
+        <w:sz w:val="14"/>
+        <w:szCs w:val="14"/>
+      </w:rPr>
+      <w:t xml:space="preserve">|   Comunidad de Madrid   |   Pág. </w:t>
     </w:r>
     <w:r>
       <w:rPr>
@@ -45711,6 +45732,48 @@
       <w:u w:val="single"/>
     </w:rPr>
   </w:style>
+  <w:style w:type="paragraph" w:styleId="Encabezado">
+    <w:name w:val="header"/>
+    <w:basedOn w:val="Normal"/>
+    <w:link w:val="EncabezadoCar"/>
+    <w:uiPriority w:val="99"/>
+    <w:unhideWhenUsed/>
+    <w:rsid w:val="00FE600F"/>
+    <w:pPr>
+      <w:tabs>
+        <w:tab w:val="center" w:pos="4252"/>
+        <w:tab w:val="right" w:pos="8504"/>
+      </w:tabs>
+    </w:pPr>
+  </w:style>
+  <w:style w:type="character" w:customStyle="1" w:styleId="EncabezadoCar">
+    <w:name w:val="Encabezado Car"/>
+    <w:basedOn w:val="Fuentedeprrafopredeter"/>
+    <w:link w:val="Encabezado"/>
+    <w:uiPriority w:val="99"/>
+    <w:rsid w:val="00FE600F"/>
+  </w:style>
+  <w:style w:type="paragraph" w:styleId="Piedepgina">
+    <w:name w:val="footer"/>
+    <w:basedOn w:val="Normal"/>
+    <w:link w:val="PiedepginaCar"/>
+    <w:uiPriority w:val="99"/>
+    <w:unhideWhenUsed/>
+    <w:rsid w:val="00FE600F"/>
+    <w:pPr>
+      <w:tabs>
+        <w:tab w:val="center" w:pos="4252"/>
+        <w:tab w:val="right" w:pos="8504"/>
+      </w:tabs>
+    </w:pPr>
+  </w:style>
+  <w:style w:type="character" w:customStyle="1" w:styleId="PiedepginaCar">
+    <w:name w:val="Pie de página Car"/>
+    <w:basedOn w:val="Fuentedeprrafopredeter"/>
+    <w:link w:val="Piedepgina"/>
+    <w:uiPriority w:val="99"/>
+    <w:rsid w:val="00FE600F"/>
+  </w:style>
 </w:styles>
 </file>
 

</xml_diff>